<commit_message>
Streamline project to pure web-based architecture: remove standalone Node server folder and update docs
</commit_message>
<xml_diff>
--- a/MediConnect_Project_Methods_Documentation.docx
+++ b/MediConnect_Project_Methods_Documentation.docx
@@ -462,7 +462,7 @@
                 <w:color w:val="1E293B"/>
                 <w:sz w:val="18"/>
               </w:rPr>
-              <w:t>16 methods</w:t>
+              <w:t>25 methods</w:t>
             </w:r>
           </w:p>
         </w:tc>
@@ -568,7 +568,7 @@
                 <w:color w:val="1E293B"/>
                 <w:sz w:val="18"/>
               </w:rPr>
-              <w:t>10 methods</w:t>
+              <w:t>14 methods</w:t>
             </w:r>
           </w:p>
         </w:tc>
@@ -596,7 +596,7 @@
                 <w:color w:val="0E7490"/>
                 <w:sz w:val="18"/>
               </w:rPr>
-              <w:t>Node.js Express Server</w:t>
+              <w:t>Frontend API Service</w:t>
             </w:r>
           </w:p>
         </w:tc>
@@ -622,7 +622,7 @@
                 <w:color w:val="1E293B"/>
                 <w:sz w:val="18"/>
               </w:rPr>
-              <w:t>server/server.js</w:t>
+              <w:t>src/api/apiService.js</w:t>
             </w:r>
           </w:p>
         </w:tc>
@@ -648,7 +648,7 @@
                 <w:color w:val="1E293B"/>
                 <w:sz w:val="18"/>
               </w:rPr>
-              <w:t>Express routing, better-sqlite3 engine, REST endpoints</w:t>
+              <w:t>Unified data access layer, local storage fallback, dual-sync</w:t>
             </w:r>
           </w:p>
         </w:tc>
@@ -674,7 +674,7 @@
                 <w:color w:val="1E293B"/>
                 <w:sz w:val="18"/>
               </w:rPr>
-              <w:t>18 endpoints</w:t>
+              <w:t>36 methods</w:t>
             </w:r>
           </w:p>
         </w:tc>
@@ -702,7 +702,7 @@
                 <w:color w:val="0E7490"/>
                 <w:sz w:val="18"/>
               </w:rPr>
-              <w:t>Frontend API Service</w:t>
+              <w:t>Firebase Cloud Sync</w:t>
             </w:r>
           </w:p>
         </w:tc>
@@ -728,7 +728,7 @@
                 <w:color w:val="1E293B"/>
                 <w:sz w:val="18"/>
               </w:rPr>
-              <w:t>src/api/apiService.js</w:t>
+              <w:t>src/api/firebaseService.js</w:t>
             </w:r>
           </w:p>
         </w:tc>
@@ -754,7 +754,7 @@
                 <w:color w:val="1E293B"/>
                 <w:sz w:val="18"/>
               </w:rPr>
-              <w:t>Unified data access layer, local storage fallback, dual-sync</w:t>
+              <w:t>Google Cloud Firestore multi-device real-time sync</w:t>
             </w:r>
           </w:p>
         </w:tc>
@@ -780,7 +780,7 @@
                 <w:color w:val="1E293B"/>
                 <w:sz w:val="18"/>
               </w:rPr>
-              <w:t>22 methods</w:t>
+              <w:t>7 methods</w:t>
             </w:r>
           </w:p>
         </w:tc>
@@ -808,7 +808,7 @@
                 <w:color w:val="0E7490"/>
                 <w:sz w:val="18"/>
               </w:rPr>
-              <w:t>Firebase Cloud Sync</w:t>
+              <w:t>AI &amp; NLP Clinical Engine</w:t>
             </w:r>
           </w:p>
         </w:tc>
@@ -834,7 +834,7 @@
                 <w:color w:val="1E293B"/>
                 <w:sz w:val="18"/>
               </w:rPr>
-              <w:t>src/api/firebaseService.js</w:t>
+              <w:t>src/components/AiAssistantModal.jsx</w:t>
             </w:r>
           </w:p>
         </w:tc>
@@ -860,7 +860,7 @@
                 <w:color w:val="1E293B"/>
                 <w:sz w:val="18"/>
               </w:rPr>
-              <w:t>Google Cloud Firestore multi-device real-time sync</w:t>
+              <w:t>Intent classification, clinical response generation, triage</w:t>
             </w:r>
           </w:p>
         </w:tc>
@@ -886,7 +886,7 @@
                 <w:color w:val="1E293B"/>
                 <w:sz w:val="18"/>
               </w:rPr>
-              <w:t>6 methods</w:t>
+              <w:t>5 methods</w:t>
             </w:r>
           </w:p>
         </w:tc>
@@ -914,7 +914,7 @@
                 <w:color w:val="0E7490"/>
                 <w:sz w:val="18"/>
               </w:rPr>
-              <w:t>AI &amp; NLP Clinical Engine</w:t>
+              <w:t>Auth &amp; Identity Management</w:t>
             </w:r>
           </w:p>
         </w:tc>
@@ -940,7 +940,7 @@
                 <w:color w:val="1E293B"/>
                 <w:sz w:val="18"/>
               </w:rPr>
-              <w:t>src/components/AiAssistantModal.jsx</w:t>
+              <w:t>src/components/LoginPage.jsx</w:t>
             </w:r>
           </w:p>
         </w:tc>
@@ -966,7 +966,7 @@
                 <w:color w:val="1E293B"/>
                 <w:sz w:val="18"/>
               </w:rPr>
-              <w:t>Intent classification, clinical response generation, triage</w:t>
+              <w:t>Multi-role login, OTP/PIN reset, doctor verification</w:t>
             </w:r>
           </w:p>
         </w:tc>
@@ -992,7 +992,7 @@
                 <w:color w:val="1E293B"/>
                 <w:sz w:val="18"/>
               </w:rPr>
-              <w:t>5 methods</w:t>
+              <w:t>8 methods</w:t>
             </w:r>
           </w:p>
         </w:tc>
@@ -1020,7 +1020,7 @@
                 <w:color w:val="0E7490"/>
                 <w:sz w:val="18"/>
               </w:rPr>
-              <w:t>Auth &amp; Identity Management</w:t>
+              <w:t>Doctor Portal &amp; EHR</w:t>
             </w:r>
           </w:p>
         </w:tc>
@@ -1046,7 +1046,7 @@
                 <w:color w:val="1E293B"/>
                 <w:sz w:val="18"/>
               </w:rPr>
-              <w:t>src/components/LoginPage.jsx</w:t>
+              <w:t>src/portals/doctor/*</w:t>
             </w:r>
           </w:p>
         </w:tc>
@@ -1072,7 +1072,7 @@
                 <w:color w:val="1E293B"/>
                 <w:sz w:val="18"/>
               </w:rPr>
-              <w:t>Multi-role login, OTP/PIN reset, doctor verification</w:t>
+              <w:t>OPD queue triage, digital prescriptions, slot manager, receptionist</w:t>
             </w:r>
           </w:p>
         </w:tc>
@@ -1098,7 +1098,7 @@
                 <w:color w:val="1E293B"/>
                 <w:sz w:val="18"/>
               </w:rPr>
-              <w:t>12 methods</w:t>
+              <w:t>9 methods</w:t>
             </w:r>
           </w:p>
         </w:tc>
@@ -1126,7 +1126,7 @@
                 <w:color w:val="0E7490"/>
                 <w:sz w:val="18"/>
               </w:rPr>
-              <w:t>Doctor Portal &amp; EHR</w:t>
+              <w:t>Patient Portal &amp; Booking</w:t>
             </w:r>
           </w:p>
         </w:tc>
@@ -1152,7 +1152,7 @@
                 <w:color w:val="1E293B"/>
                 <w:sz w:val="18"/>
               </w:rPr>
-              <w:t>src/portals/doctor/*</w:t>
+              <w:t>src/portals/patient/*</w:t>
             </w:r>
           </w:p>
         </w:tc>
@@ -1178,7 +1178,7 @@
                 <w:color w:val="1E293B"/>
                 <w:sz w:val="18"/>
               </w:rPr>
-              <w:t>OPD queue triage, digital prescriptions, slot manager, receptionist</w:t>
+              <w:t>Doctor search, slot booking, lab tracking, profile settings</w:t>
             </w:r>
           </w:p>
         </w:tc>
@@ -1204,7 +1204,7 @@
                 <w:color w:val="1E293B"/>
                 <w:sz w:val="18"/>
               </w:rPr>
-              <w:t>16 methods</w:t>
+              <w:t>7 methods</w:t>
             </w:r>
           </w:p>
         </w:tc>
@@ -1232,7 +1232,7 @@
                 <w:color w:val="0E7490"/>
                 <w:sz w:val="18"/>
               </w:rPr>
-              <w:t>Patient Portal &amp; Booking</w:t>
+              <w:t>Receptionist Desk Portal</w:t>
             </w:r>
           </w:p>
         </w:tc>
@@ -1258,7 +1258,7 @@
                 <w:color w:val="1E293B"/>
                 <w:sz w:val="18"/>
               </w:rPr>
-              <w:t>src/portals/patient/*</w:t>
+              <w:t>src/portals/receptionist/*</w:t>
             </w:r>
           </w:p>
         </w:tc>
@@ -1284,7 +1284,7 @@
                 <w:color w:val="1E293B"/>
                 <w:sz w:val="18"/>
               </w:rPr>
-              <w:t>Doctor search, slot booking, lab tracking, profile settings</w:t>
+              <w:t>Queue status updates, walk-in tokens, doctor roster monitoring</w:t>
             </w:r>
           </w:p>
         </w:tc>
@@ -1310,7 +1310,7 @@
                 <w:color w:val="1E293B"/>
                 <w:sz w:val="18"/>
               </w:rPr>
-              <w:t>14 methods</w:t>
+              <w:t>5 methods</w:t>
             </w:r>
           </w:p>
         </w:tc>
@@ -1338,7 +1338,7 @@
                 <w:color w:val="0E7490"/>
                 <w:sz w:val="18"/>
               </w:rPr>
-              <w:t>Receptionist Desk Portal</w:t>
+              <w:t>Admin Management &amp; Stats</w:t>
             </w:r>
           </w:p>
         </w:tc>
@@ -1364,7 +1364,7 @@
                 <w:color w:val="1E293B"/>
                 <w:sz w:val="18"/>
               </w:rPr>
-              <w:t>src/portals/receptionist/*</w:t>
+              <w:t>src/portals/admin/*</w:t>
             </w:r>
           </w:p>
         </w:tc>
@@ -1390,7 +1390,7 @@
                 <w:color w:val="1E293B"/>
                 <w:sz w:val="18"/>
               </w:rPr>
-              <w:t>Queue status updates, walk-in tokens, doctor roster monitoring</w:t>
+              <w:t>Department/Doctor CRUD, revenue analytics, audit trails</w:t>
             </w:r>
           </w:p>
         </w:tc>
@@ -1416,7 +1416,7 @@
                 <w:color w:val="1E293B"/>
                 <w:sz w:val="18"/>
               </w:rPr>
-              <w:t>6 methods</w:t>
+              <w:t>5 methods</w:t>
             </w:r>
           </w:p>
         </w:tc>
@@ -1444,7 +1444,7 @@
                 <w:color w:val="0E7490"/>
                 <w:sz w:val="18"/>
               </w:rPr>
-              <w:t>Admin Management &amp; Stats</w:t>
+              <w:t>Pan-India Shared EHR</w:t>
             </w:r>
           </w:p>
         </w:tc>
@@ -1470,7 +1470,7 @@
                 <w:color w:val="1E293B"/>
                 <w:sz w:val="18"/>
               </w:rPr>
-              <w:t>src/portals/admin/*</w:t>
+              <w:t>src/portals/shared/*</w:t>
             </w:r>
           </w:p>
         </w:tc>
@@ -1496,7 +1496,7 @@
                 <w:color w:val="1E293B"/>
                 <w:sz w:val="18"/>
               </w:rPr>
-              <w:t>Department/Doctor CRUD, revenue analytics, audit trails</w:t>
+              <w:t>Passcode &amp; OTP-protected doctor-patient records sharing</w:t>
             </w:r>
           </w:p>
         </w:tc>
@@ -1522,113 +1522,7 @@
                 <w:color w:val="1E293B"/>
                 <w:sz w:val="18"/>
               </w:rPr>
-              <w:t>10 methods</w:t>
-            </w:r>
-          </w:p>
-        </w:tc>
-      </w:tr>
-      <w:tr>
-        <w:tc>
-          <w:tcPr>
-            <w:tcW w:type="dxa" w:w="2592"/>
-            <w:shd w:fill="F8FAFC"/>
-            <w:tcMar>
-              <w:top w:w="90" w:type="dxa"/>
-              <w:bottom w:w="90" w:type="dxa"/>
-              <w:left w:w="140" w:type="dxa"/>
-              <w:right w:w="140" w:type="dxa"/>
-            </w:tcMar>
-          </w:tcPr>
-          <w:p>
-            <w:pPr>
-              <w:jc w:val="left"/>
-            </w:pPr>
-            <w:r>
-              <w:rPr>
-                <w:rFonts w:ascii="Consolas" w:hAnsi="Consolas"/>
-                <w:b/>
-                <w:color w:val="0E7490"/>
-                <w:sz w:val="18"/>
-              </w:rPr>
-              <w:t>Pan-India Shared EHR</w:t>
-            </w:r>
-          </w:p>
-        </w:tc>
-        <w:tc>
-          <w:tcPr>
-            <w:tcW w:type="dxa" w:w="2592"/>
-            <w:shd w:fill="F8FAFC"/>
-            <w:tcMar>
-              <w:top w:w="90" w:type="dxa"/>
-              <w:bottom w:w="90" w:type="dxa"/>
-              <w:left w:w="140" w:type="dxa"/>
-              <w:right w:w="140" w:type="dxa"/>
-            </w:tcMar>
-          </w:tcPr>
-          <w:p>
-            <w:pPr>
-              <w:jc w:val="left"/>
-            </w:pPr>
-            <w:r>
-              <w:rPr>
-                <w:rFonts w:ascii="Arial" w:hAnsi="Arial"/>
-                <w:b w:val="0"/>
-                <w:color w:val="1E293B"/>
-                <w:sz w:val="18"/>
-              </w:rPr>
-              <w:t>src/portals/shared/*</w:t>
-            </w:r>
-          </w:p>
-        </w:tc>
-        <w:tc>
-          <w:tcPr>
-            <w:tcW w:type="dxa" w:w="3744"/>
-            <w:shd w:fill="F8FAFC"/>
-            <w:tcMar>
-              <w:top w:w="90" w:type="dxa"/>
-              <w:bottom w:w="90" w:type="dxa"/>
-              <w:left w:w="140" w:type="dxa"/>
-              <w:right w:w="140" w:type="dxa"/>
-            </w:tcMar>
-          </w:tcPr>
-          <w:p>
-            <w:pPr>
-              <w:jc w:val="left"/>
-            </w:pPr>
-            <w:r>
-              <w:rPr>
-                <w:rFonts w:ascii="Arial" w:hAnsi="Arial"/>
-                <w:b w:val="0"/>
-                <w:color w:val="1E293B"/>
-                <w:sz w:val="18"/>
-              </w:rPr>
-              <w:t>Passcode &amp; OTP-protected doctor-patient records sharing</w:t>
-            </w:r>
-          </w:p>
-        </w:tc>
-        <w:tc>
-          <w:tcPr>
-            <w:tcW w:type="dxa" w:w="1152"/>
-            <w:shd w:fill="F8FAFC"/>
-            <w:tcMar>
-              <w:top w:w="90" w:type="dxa"/>
-              <w:bottom w:w="90" w:type="dxa"/>
-              <w:left w:w="140" w:type="dxa"/>
-              <w:right w:w="140" w:type="dxa"/>
-            </w:tcMar>
-          </w:tcPr>
-          <w:p>
-            <w:pPr>
-              <w:jc w:val="left"/>
-            </w:pPr>
-            <w:r>
-              <w:rPr>
-                <w:rFonts w:ascii="Arial" w:hAnsi="Arial"/>
-                <w:b w:val="0"/>
-                <w:color w:val="1E293B"/>
-                <w:sz w:val="18"/>
-              </w:rPr>
-              <w:t>8 methods</w:t>
+              <w:t>4 methods</w:t>
             </w:r>
           </w:p>
         </w:tc>
@@ -6099,3347 +5993,7 @@
         <w:spacing w:before="320" w:after="80"/>
       </w:pPr>
       <w:r>
-        <w:t>4. Node.js + Express + better-sqlite3 Backend Server</w:t>
-      </w:r>
-    </w:p>
-    <w:p>
-      <w:pPr>
-        <w:spacing w:after="80"/>
-      </w:pPr>
-      <w:r>
-        <w:rPr>
-          <w:b/>
-        </w:rPr>
-        <w:t xml:space="preserve">Source File: </w:t>
-      </w:r>
-      <w:r>
-        <w:rPr>
-          <w:rFonts w:ascii="Consolas" w:hAnsi="Consolas"/>
-          <w:color w:val="0E7490"/>
-        </w:rPr>
-        <w:t>server/server.js</w:t>
-      </w:r>
-    </w:p>
-    <w:p>
-      <w:pPr>
-        <w:spacing w:after="160"/>
-      </w:pPr>
-      <w:r>
-        <w:t>High-performance alternative Node.js backend using better-sqlite3 with WAL (Write-Ahead Logging) mode. Provides full REST endpoints, sample order tracking, and AI chat persistence.</w:t>
-      </w:r>
-    </w:p>
-    <w:tbl>
-      <w:tblPr>
-        <w:tblW w:type="auto" w:w="0"/>
-        <w:jc w:val="center"/>
-        <w:tblLayout w:type="fixed"/>
-        <w:tblLook w:firstColumn="1" w:firstRow="1" w:lastColumn="0" w:lastRow="0" w:noHBand="0" w:noVBand="1" w:val="04A0"/>
-      </w:tblPr>
-      <w:tblGrid>
-        <w:gridCol w:w="2520"/>
-        <w:gridCol w:w="2520"/>
-        <w:gridCol w:w="2520"/>
-        <w:gridCol w:w="2520"/>
-      </w:tblGrid>
-      <w:tr>
-        <w:tc>
-          <w:tcPr>
-            <w:tcW w:type="dxa" w:w="2592"/>
-            <w:shd w:fill="0F766E"/>
-            <w:tcMar>
-              <w:top w:w="120" w:type="dxa"/>
-              <w:bottom w:w="120" w:type="dxa"/>
-              <w:left w:w="150" w:type="dxa"/>
-              <w:right w:w="150" w:type="dxa"/>
-            </w:tcMar>
-          </w:tcPr>
-          <w:p>
-            <w:pPr>
-              <w:jc w:val="left"/>
-            </w:pPr>
-            <w:r>
-              <w:rPr>
-                <w:rFonts w:ascii="Arial" w:hAnsi="Arial"/>
-                <w:b/>
-                <w:color w:val="FFFFFF"/>
-                <w:sz w:val="20"/>
-              </w:rPr>
-              <w:t>Endpoint / Method</w:t>
-            </w:r>
-          </w:p>
-        </w:tc>
-        <w:tc>
-          <w:tcPr>
-            <w:tcW w:type="dxa" w:w="2016"/>
-            <w:shd w:fill="0F766E"/>
-            <w:tcMar>
-              <w:top w:w="120" w:type="dxa"/>
-              <w:bottom w:w="120" w:type="dxa"/>
-              <w:left w:w="150" w:type="dxa"/>
-              <w:right w:w="150" w:type="dxa"/>
-            </w:tcMar>
-          </w:tcPr>
-          <w:p>
-            <w:pPr>
-              <w:jc w:val="left"/>
-            </w:pPr>
-            <w:r>
-              <w:rPr>
-                <w:rFonts w:ascii="Arial" w:hAnsi="Arial"/>
-                <w:b/>
-                <w:color w:val="FFFFFF"/>
-                <w:sz w:val="20"/>
-              </w:rPr>
-              <w:t>Parameters / Body</w:t>
-            </w:r>
-          </w:p>
-        </w:tc>
-        <w:tc>
-          <w:tcPr>
-            <w:tcW w:type="dxa" w:w="1584"/>
-            <w:shd w:fill="0F766E"/>
-            <w:tcMar>
-              <w:top w:w="120" w:type="dxa"/>
-              <w:bottom w:w="120" w:type="dxa"/>
-              <w:left w:w="150" w:type="dxa"/>
-              <w:right w:w="150" w:type="dxa"/>
-            </w:tcMar>
-          </w:tcPr>
-          <w:p>
-            <w:pPr>
-              <w:jc w:val="left"/>
-            </w:pPr>
-            <w:r>
-              <w:rPr>
-                <w:rFonts w:ascii="Arial" w:hAnsi="Arial"/>
-                <w:b/>
-                <w:color w:val="FFFFFF"/>
-                <w:sz w:val="20"/>
-              </w:rPr>
-              <w:t>Return Type</w:t>
-            </w:r>
-          </w:p>
-        </w:tc>
-        <w:tc>
-          <w:tcPr>
-            <w:tcW w:type="dxa" w:w="3888"/>
-            <w:shd w:fill="0F766E"/>
-            <w:tcMar>
-              <w:top w:w="120" w:type="dxa"/>
-              <w:bottom w:w="120" w:type="dxa"/>
-              <w:left w:w="150" w:type="dxa"/>
-              <w:right w:w="150" w:type="dxa"/>
-            </w:tcMar>
-          </w:tcPr>
-          <w:p>
-            <w:pPr>
-              <w:jc w:val="left"/>
-            </w:pPr>
-            <w:r>
-              <w:rPr>
-                <w:rFonts w:ascii="Arial" w:hAnsi="Arial"/>
-                <w:b/>
-                <w:color w:val="FFFFFF"/>
-                <w:sz w:val="20"/>
-              </w:rPr>
-              <w:t>Description &amp; Implementation Role</w:t>
-            </w:r>
-          </w:p>
-        </w:tc>
-      </w:tr>
-      <w:tr>
-        <w:tc>
-          <w:tcPr>
-            <w:tcW w:type="dxa" w:w="2592"/>
-            <w:shd w:fill="FFFFFF"/>
-            <w:tcMar>
-              <w:top w:w="90" w:type="dxa"/>
-              <w:bottom w:w="90" w:type="dxa"/>
-              <w:left w:w="140" w:type="dxa"/>
-              <w:right w:w="140" w:type="dxa"/>
-            </w:tcMar>
-          </w:tcPr>
-          <w:p>
-            <w:pPr>
-              <w:jc w:val="left"/>
-            </w:pPr>
-            <w:r>
-              <w:rPr>
-                <w:rFonts w:ascii="Consolas" w:hAnsi="Consolas"/>
-                <w:b/>
-                <w:color w:val="0E7490"/>
-                <w:sz w:val="18"/>
-              </w:rPr>
-              <w:t>doctorRow(row)</w:t>
-            </w:r>
-          </w:p>
-        </w:tc>
-        <w:tc>
-          <w:tcPr>
-            <w:tcW w:type="dxa" w:w="2016"/>
-            <w:shd w:fill="FFFFFF"/>
-            <w:tcMar>
-              <w:top w:w="90" w:type="dxa"/>
-              <w:bottom w:w="90" w:type="dxa"/>
-              <w:left w:w="140" w:type="dxa"/>
-              <w:right w:w="140" w:type="dxa"/>
-            </w:tcMar>
-          </w:tcPr>
-          <w:p>
-            <w:pPr>
-              <w:jc w:val="left"/>
-            </w:pPr>
-            <w:r>
-              <w:rPr>
-                <w:rFonts w:ascii="Arial" w:hAnsi="Arial"/>
-                <w:b w:val="0"/>
-                <w:color w:val="1E293B"/>
-                <w:sz w:val="18"/>
-              </w:rPr>
-              <w:t>row: sqlite3.Row</w:t>
-            </w:r>
-          </w:p>
-        </w:tc>
-        <w:tc>
-          <w:tcPr>
-            <w:tcW w:type="dxa" w:w="1584"/>
-            <w:shd w:fill="FFFFFF"/>
-            <w:tcMar>
-              <w:top w:w="90" w:type="dxa"/>
-              <w:bottom w:w="90" w:type="dxa"/>
-              <w:left w:w="140" w:type="dxa"/>
-              <w:right w:w="140" w:type="dxa"/>
-            </w:tcMar>
-          </w:tcPr>
-          <w:p>
-            <w:pPr>
-              <w:jc w:val="left"/>
-            </w:pPr>
-            <w:r>
-              <w:rPr>
-                <w:rFonts w:ascii="Arial" w:hAnsi="Arial"/>
-                <w:b w:val="0"/>
-                <w:color w:val="1E293B"/>
-                <w:sz w:val="18"/>
-              </w:rPr>
-              <w:t>object</w:t>
-            </w:r>
-          </w:p>
-        </w:tc>
-        <w:tc>
-          <w:tcPr>
-            <w:tcW w:type="dxa" w:w="3888"/>
-            <w:shd w:fill="FFFFFF"/>
-            <w:tcMar>
-              <w:top w:w="90" w:type="dxa"/>
-              <w:bottom w:w="90" w:type="dxa"/>
-              <w:left w:w="140" w:type="dxa"/>
-              <w:right w:w="140" w:type="dxa"/>
-            </w:tcMar>
-          </w:tcPr>
-          <w:p>
-            <w:pPr>
-              <w:jc w:val="left"/>
-            </w:pPr>
-            <w:r>
-              <w:rPr>
-                <w:rFonts w:ascii="Arial" w:hAnsi="Arial"/>
-                <w:b w:val="0"/>
-                <w:color w:val="1E293B"/>
-                <w:sz w:val="18"/>
-              </w:rPr>
-              <w:t>Maps raw database doctor columns to frontend camelCase object and parses JSON available_slots/languages.</w:t>
-            </w:r>
-          </w:p>
-        </w:tc>
-      </w:tr>
-      <w:tr>
-        <w:tc>
-          <w:tcPr>
-            <w:tcW w:type="dxa" w:w="2592"/>
-            <w:shd w:fill="F8FAFC"/>
-            <w:tcMar>
-              <w:top w:w="90" w:type="dxa"/>
-              <w:bottom w:w="90" w:type="dxa"/>
-              <w:left w:w="140" w:type="dxa"/>
-              <w:right w:w="140" w:type="dxa"/>
-            </w:tcMar>
-          </w:tcPr>
-          <w:p>
-            <w:pPr>
-              <w:jc w:val="left"/>
-            </w:pPr>
-            <w:r>
-              <w:rPr>
-                <w:rFonts w:ascii="Consolas" w:hAnsi="Consolas"/>
-                <w:b/>
-                <w:color w:val="0E7490"/>
-                <w:sz w:val="18"/>
-              </w:rPr>
-              <w:t>deptRow(row)</w:t>
-            </w:r>
-          </w:p>
-        </w:tc>
-        <w:tc>
-          <w:tcPr>
-            <w:tcW w:type="dxa" w:w="2016"/>
-            <w:shd w:fill="F8FAFC"/>
-            <w:tcMar>
-              <w:top w:w="90" w:type="dxa"/>
-              <w:bottom w:w="90" w:type="dxa"/>
-              <w:left w:w="140" w:type="dxa"/>
-              <w:right w:w="140" w:type="dxa"/>
-            </w:tcMar>
-          </w:tcPr>
-          <w:p>
-            <w:pPr>
-              <w:jc w:val="left"/>
-            </w:pPr>
-            <w:r>
-              <w:rPr>
-                <w:rFonts w:ascii="Arial" w:hAnsi="Arial"/>
-                <w:b w:val="0"/>
-                <w:color w:val="1E293B"/>
-                <w:sz w:val="18"/>
-              </w:rPr>
-              <w:t>row: sqlite3.Row</w:t>
-            </w:r>
-          </w:p>
-        </w:tc>
-        <w:tc>
-          <w:tcPr>
-            <w:tcW w:type="dxa" w:w="1584"/>
-            <w:shd w:fill="F8FAFC"/>
-            <w:tcMar>
-              <w:top w:w="90" w:type="dxa"/>
-              <w:bottom w:w="90" w:type="dxa"/>
-              <w:left w:w="140" w:type="dxa"/>
-              <w:right w:w="140" w:type="dxa"/>
-            </w:tcMar>
-          </w:tcPr>
-          <w:p>
-            <w:pPr>
-              <w:jc w:val="left"/>
-            </w:pPr>
-            <w:r>
-              <w:rPr>
-                <w:rFonts w:ascii="Arial" w:hAnsi="Arial"/>
-                <w:b w:val="0"/>
-                <w:color w:val="1E293B"/>
-                <w:sz w:val="18"/>
-              </w:rPr>
-              <w:t>object</w:t>
-            </w:r>
-          </w:p>
-        </w:tc>
-        <w:tc>
-          <w:tcPr>
-            <w:tcW w:type="dxa" w:w="3888"/>
-            <w:shd w:fill="F8FAFC"/>
-            <w:tcMar>
-              <w:top w:w="90" w:type="dxa"/>
-              <w:bottom w:w="90" w:type="dxa"/>
-              <w:left w:w="140" w:type="dxa"/>
-              <w:right w:w="140" w:type="dxa"/>
-            </w:tcMar>
-          </w:tcPr>
-          <w:p>
-            <w:pPr>
-              <w:jc w:val="left"/>
-            </w:pPr>
-            <w:r>
-              <w:rPr>
-                <w:rFonts w:ascii="Arial" w:hAnsi="Arial"/>
-                <w:b w:val="0"/>
-                <w:color w:val="1E293B"/>
-                <w:sz w:val="18"/>
-              </w:rPr>
-              <w:t>Maps department table columns to JSON schema including color, room, and lead doctor.</w:t>
-            </w:r>
-          </w:p>
-        </w:tc>
-      </w:tr>
-      <w:tr>
-        <w:tc>
-          <w:tcPr>
-            <w:tcW w:type="dxa" w:w="2592"/>
-            <w:shd w:fill="FFFFFF"/>
-            <w:tcMar>
-              <w:top w:w="90" w:type="dxa"/>
-              <w:bottom w:w="90" w:type="dxa"/>
-              <w:left w:w="140" w:type="dxa"/>
-              <w:right w:w="140" w:type="dxa"/>
-            </w:tcMar>
-          </w:tcPr>
-          <w:p>
-            <w:pPr>
-              <w:jc w:val="left"/>
-            </w:pPr>
-            <w:r>
-              <w:rPr>
-                <w:rFonts w:ascii="Consolas" w:hAnsi="Consolas"/>
-                <w:b/>
-                <w:color w:val="0E7490"/>
-                <w:sz w:val="18"/>
-              </w:rPr>
-              <w:t>patientRow(row)</w:t>
-            </w:r>
-          </w:p>
-        </w:tc>
-        <w:tc>
-          <w:tcPr>
-            <w:tcW w:type="dxa" w:w="2016"/>
-            <w:shd w:fill="FFFFFF"/>
-            <w:tcMar>
-              <w:top w:w="90" w:type="dxa"/>
-              <w:bottom w:w="90" w:type="dxa"/>
-              <w:left w:w="140" w:type="dxa"/>
-              <w:right w:w="140" w:type="dxa"/>
-            </w:tcMar>
-          </w:tcPr>
-          <w:p>
-            <w:pPr>
-              <w:jc w:val="left"/>
-            </w:pPr>
-            <w:r>
-              <w:rPr>
-                <w:rFonts w:ascii="Arial" w:hAnsi="Arial"/>
-                <w:b w:val="0"/>
-                <w:color w:val="1E293B"/>
-                <w:sz w:val="18"/>
-              </w:rPr>
-              <w:t>row: sqlite3.Row</w:t>
-            </w:r>
-          </w:p>
-        </w:tc>
-        <w:tc>
-          <w:tcPr>
-            <w:tcW w:type="dxa" w:w="1584"/>
-            <w:shd w:fill="FFFFFF"/>
-            <w:tcMar>
-              <w:top w:w="90" w:type="dxa"/>
-              <w:bottom w:w="90" w:type="dxa"/>
-              <w:left w:w="140" w:type="dxa"/>
-              <w:right w:w="140" w:type="dxa"/>
-            </w:tcMar>
-          </w:tcPr>
-          <w:p>
-            <w:pPr>
-              <w:jc w:val="left"/>
-            </w:pPr>
-            <w:r>
-              <w:rPr>
-                <w:rFonts w:ascii="Arial" w:hAnsi="Arial"/>
-                <w:b w:val="0"/>
-                <w:color w:val="1E293B"/>
-                <w:sz w:val="18"/>
-              </w:rPr>
-              <w:t>object</w:t>
-            </w:r>
-          </w:p>
-        </w:tc>
-        <w:tc>
-          <w:tcPr>
-            <w:tcW w:type="dxa" w:w="3888"/>
-            <w:shd w:fill="FFFFFF"/>
-            <w:tcMar>
-              <w:top w:w="90" w:type="dxa"/>
-              <w:bottom w:w="90" w:type="dxa"/>
-              <w:left w:w="140" w:type="dxa"/>
-              <w:right w:w="140" w:type="dxa"/>
-            </w:tcMar>
-          </w:tcPr>
-          <w:p>
-            <w:pPr>
-              <w:jc w:val="left"/>
-            </w:pPr>
-            <w:r>
-              <w:rPr>
-                <w:rFonts w:ascii="Arial" w:hAnsi="Arial"/>
-                <w:b w:val="0"/>
-                <w:color w:val="1E293B"/>
-                <w:sz w:val="18"/>
-              </w:rPr>
-              <w:t>Maps patient columns, parsing JSON allergies, chronicConditions, and emergencyContact.</w:t>
-            </w:r>
-          </w:p>
-        </w:tc>
-      </w:tr>
-      <w:tr>
-        <w:tc>
-          <w:tcPr>
-            <w:tcW w:type="dxa" w:w="2592"/>
-            <w:shd w:fill="F8FAFC"/>
-            <w:tcMar>
-              <w:top w:w="90" w:type="dxa"/>
-              <w:bottom w:w="90" w:type="dxa"/>
-              <w:left w:w="140" w:type="dxa"/>
-              <w:right w:w="140" w:type="dxa"/>
-            </w:tcMar>
-          </w:tcPr>
-          <w:p>
-            <w:pPr>
-              <w:jc w:val="left"/>
-            </w:pPr>
-            <w:r>
-              <w:rPr>
-                <w:rFonts w:ascii="Consolas" w:hAnsi="Consolas"/>
-                <w:b/>
-                <w:color w:val="0E7490"/>
-                <w:sz w:val="18"/>
-              </w:rPr>
-              <w:t>apptRow(row)</w:t>
-            </w:r>
-          </w:p>
-        </w:tc>
-        <w:tc>
-          <w:tcPr>
-            <w:tcW w:type="dxa" w:w="2016"/>
-            <w:shd w:fill="F8FAFC"/>
-            <w:tcMar>
-              <w:top w:w="90" w:type="dxa"/>
-              <w:bottom w:w="90" w:type="dxa"/>
-              <w:left w:w="140" w:type="dxa"/>
-              <w:right w:w="140" w:type="dxa"/>
-            </w:tcMar>
-          </w:tcPr>
-          <w:p>
-            <w:pPr>
-              <w:jc w:val="left"/>
-            </w:pPr>
-            <w:r>
-              <w:rPr>
-                <w:rFonts w:ascii="Arial" w:hAnsi="Arial"/>
-                <w:b w:val="0"/>
-                <w:color w:val="1E293B"/>
-                <w:sz w:val="18"/>
-              </w:rPr>
-              <w:t>row: sqlite3.Row</w:t>
-            </w:r>
-          </w:p>
-        </w:tc>
-        <w:tc>
-          <w:tcPr>
-            <w:tcW w:type="dxa" w:w="1584"/>
-            <w:shd w:fill="F8FAFC"/>
-            <w:tcMar>
-              <w:top w:w="90" w:type="dxa"/>
-              <w:bottom w:w="90" w:type="dxa"/>
-              <w:left w:w="140" w:type="dxa"/>
-              <w:right w:w="140" w:type="dxa"/>
-            </w:tcMar>
-          </w:tcPr>
-          <w:p>
-            <w:pPr>
-              <w:jc w:val="left"/>
-            </w:pPr>
-            <w:r>
-              <w:rPr>
-                <w:rFonts w:ascii="Arial" w:hAnsi="Arial"/>
-                <w:b w:val="0"/>
-                <w:color w:val="1E293B"/>
-                <w:sz w:val="18"/>
-              </w:rPr>
-              <w:t>object</w:t>
-            </w:r>
-          </w:p>
-        </w:tc>
-        <w:tc>
-          <w:tcPr>
-            <w:tcW w:type="dxa" w:w="3888"/>
-            <w:shd w:fill="F8FAFC"/>
-            <w:tcMar>
-              <w:top w:w="90" w:type="dxa"/>
-              <w:bottom w:w="90" w:type="dxa"/>
-              <w:left w:w="140" w:type="dxa"/>
-              <w:right w:w="140" w:type="dxa"/>
-            </w:tcMar>
-          </w:tcPr>
-          <w:p>
-            <w:pPr>
-              <w:jc w:val="left"/>
-            </w:pPr>
-            <w:r>
-              <w:rPr>
-                <w:rFonts w:ascii="Arial" w:hAnsi="Arial"/>
-                <w:b w:val="0"/>
-                <w:color w:val="1E293B"/>
-                <w:sz w:val="18"/>
-              </w:rPr>
-              <w:t>Normalizes appointment records with doctor name, token number, and prescription link.</w:t>
-            </w:r>
-          </w:p>
-        </w:tc>
-      </w:tr>
-      <w:tr>
-        <w:tc>
-          <w:tcPr>
-            <w:tcW w:type="dxa" w:w="2592"/>
-            <w:shd w:fill="FFFFFF"/>
-            <w:tcMar>
-              <w:top w:w="90" w:type="dxa"/>
-              <w:bottom w:w="90" w:type="dxa"/>
-              <w:left w:w="140" w:type="dxa"/>
-              <w:right w:w="140" w:type="dxa"/>
-            </w:tcMar>
-          </w:tcPr>
-          <w:p>
-            <w:pPr>
-              <w:jc w:val="left"/>
-            </w:pPr>
-            <w:r>
-              <w:rPr>
-                <w:rFonts w:ascii="Consolas" w:hAnsi="Consolas"/>
-                <w:b/>
-                <w:color w:val="0E7490"/>
-                <w:sz w:val="18"/>
-              </w:rPr>
-              <w:t>rxRow(row)</w:t>
-            </w:r>
-          </w:p>
-        </w:tc>
-        <w:tc>
-          <w:tcPr>
-            <w:tcW w:type="dxa" w:w="2016"/>
-            <w:shd w:fill="FFFFFF"/>
-            <w:tcMar>
-              <w:top w:w="90" w:type="dxa"/>
-              <w:bottom w:w="90" w:type="dxa"/>
-              <w:left w:w="140" w:type="dxa"/>
-              <w:right w:w="140" w:type="dxa"/>
-            </w:tcMar>
-          </w:tcPr>
-          <w:p>
-            <w:pPr>
-              <w:jc w:val="left"/>
-            </w:pPr>
-            <w:r>
-              <w:rPr>
-                <w:rFonts w:ascii="Arial" w:hAnsi="Arial"/>
-                <w:b w:val="0"/>
-                <w:color w:val="1E293B"/>
-                <w:sz w:val="18"/>
-              </w:rPr>
-              <w:t>row: sqlite3.Row</w:t>
-            </w:r>
-          </w:p>
-        </w:tc>
-        <w:tc>
-          <w:tcPr>
-            <w:tcW w:type="dxa" w:w="1584"/>
-            <w:shd w:fill="FFFFFF"/>
-            <w:tcMar>
-              <w:top w:w="90" w:type="dxa"/>
-              <w:bottom w:w="90" w:type="dxa"/>
-              <w:left w:w="140" w:type="dxa"/>
-              <w:right w:w="140" w:type="dxa"/>
-            </w:tcMar>
-          </w:tcPr>
-          <w:p>
-            <w:pPr>
-              <w:jc w:val="left"/>
-            </w:pPr>
-            <w:r>
-              <w:rPr>
-                <w:rFonts w:ascii="Arial" w:hAnsi="Arial"/>
-                <w:b w:val="0"/>
-                <w:color w:val="1E293B"/>
-                <w:sz w:val="18"/>
-              </w:rPr>
-              <w:t>object</w:t>
-            </w:r>
-          </w:p>
-        </w:tc>
-        <w:tc>
-          <w:tcPr>
-            <w:tcW w:type="dxa" w:w="3888"/>
-            <w:shd w:fill="FFFFFF"/>
-            <w:tcMar>
-              <w:top w:w="90" w:type="dxa"/>
-              <w:bottom w:w="90" w:type="dxa"/>
-              <w:left w:w="140" w:type="dxa"/>
-              <w:right w:w="140" w:type="dxa"/>
-            </w:tcMar>
-          </w:tcPr>
-          <w:p>
-            <w:pPr>
-              <w:jc w:val="left"/>
-            </w:pPr>
-            <w:r>
-              <w:rPr>
-                <w:rFonts w:ascii="Arial" w:hAnsi="Arial"/>
-                <w:b w:val="0"/>
-                <w:color w:val="1E293B"/>
-                <w:sz w:val="18"/>
-              </w:rPr>
-              <w:t>Transforms prescription records, parsing JSON medications list and dosage schedules.</w:t>
-            </w:r>
-          </w:p>
-        </w:tc>
-      </w:tr>
-      <w:tr>
-        <w:tc>
-          <w:tcPr>
-            <w:tcW w:type="dxa" w:w="2592"/>
-            <w:shd w:fill="F8FAFC"/>
-            <w:tcMar>
-              <w:top w:w="90" w:type="dxa"/>
-              <w:bottom w:w="90" w:type="dxa"/>
-              <w:left w:w="140" w:type="dxa"/>
-              <w:right w:w="140" w:type="dxa"/>
-            </w:tcMar>
-          </w:tcPr>
-          <w:p>
-            <w:pPr>
-              <w:jc w:val="left"/>
-            </w:pPr>
-            <w:r>
-              <w:rPr>
-                <w:rFonts w:ascii="Consolas" w:hAnsi="Consolas"/>
-                <w:b/>
-                <w:color w:val="0E7490"/>
-                <w:sz w:val="18"/>
-              </w:rPr>
-              <w:t>labRow(row)</w:t>
-            </w:r>
-          </w:p>
-        </w:tc>
-        <w:tc>
-          <w:tcPr>
-            <w:tcW w:type="dxa" w:w="2016"/>
-            <w:shd w:fill="F8FAFC"/>
-            <w:tcMar>
-              <w:top w:w="90" w:type="dxa"/>
-              <w:bottom w:w="90" w:type="dxa"/>
-              <w:left w:w="140" w:type="dxa"/>
-              <w:right w:w="140" w:type="dxa"/>
-            </w:tcMar>
-          </w:tcPr>
-          <w:p>
-            <w:pPr>
-              <w:jc w:val="left"/>
-            </w:pPr>
-            <w:r>
-              <w:rPr>
-                <w:rFonts w:ascii="Arial" w:hAnsi="Arial"/>
-                <w:b w:val="0"/>
-                <w:color w:val="1E293B"/>
-                <w:sz w:val="18"/>
-              </w:rPr>
-              <w:t>row: sqlite3.Row</w:t>
-            </w:r>
-          </w:p>
-        </w:tc>
-        <w:tc>
-          <w:tcPr>
-            <w:tcW w:type="dxa" w:w="1584"/>
-            <w:shd w:fill="F8FAFC"/>
-            <w:tcMar>
-              <w:top w:w="90" w:type="dxa"/>
-              <w:bottom w:w="90" w:type="dxa"/>
-              <w:left w:w="140" w:type="dxa"/>
-              <w:right w:w="140" w:type="dxa"/>
-            </w:tcMar>
-          </w:tcPr>
-          <w:p>
-            <w:pPr>
-              <w:jc w:val="left"/>
-            </w:pPr>
-            <w:r>
-              <w:rPr>
-                <w:rFonts w:ascii="Arial" w:hAnsi="Arial"/>
-                <w:b w:val="0"/>
-                <w:color w:val="1E293B"/>
-                <w:sz w:val="18"/>
-              </w:rPr>
-              <w:t>object</w:t>
-            </w:r>
-          </w:p>
-        </w:tc>
-        <w:tc>
-          <w:tcPr>
-            <w:tcW w:type="dxa" w:w="3888"/>
-            <w:shd w:fill="F8FAFC"/>
-            <w:tcMar>
-              <w:top w:w="90" w:type="dxa"/>
-              <w:bottom w:w="90" w:type="dxa"/>
-              <w:left w:w="140" w:type="dxa"/>
-              <w:right w:w="140" w:type="dxa"/>
-            </w:tcMar>
-          </w:tcPr>
-          <w:p>
-            <w:pPr>
-              <w:jc w:val="left"/>
-            </w:pPr>
-            <w:r>
-              <w:rPr>
-                <w:rFonts w:ascii="Arial" w:hAnsi="Arial"/>
-                <w:b w:val="0"/>
-                <w:color w:val="1E293B"/>
-                <w:sz w:val="18"/>
-              </w:rPr>
-              <w:t>Parses diagnostic results JSON structure with reference normal ranges and high/low flags.</w:t>
-            </w:r>
-          </w:p>
-        </w:tc>
-      </w:tr>
-      <w:tr>
-        <w:tc>
-          <w:tcPr>
-            <w:tcW w:type="dxa" w:w="2592"/>
-            <w:shd w:fill="FFFFFF"/>
-            <w:tcMar>
-              <w:top w:w="90" w:type="dxa"/>
-              <w:bottom w:w="90" w:type="dxa"/>
-              <w:left w:w="140" w:type="dxa"/>
-              <w:right w:w="140" w:type="dxa"/>
-            </w:tcMar>
-          </w:tcPr>
-          <w:p>
-            <w:pPr>
-              <w:jc w:val="left"/>
-            </w:pPr>
-            <w:r>
-              <w:rPr>
-                <w:rFonts w:ascii="Consolas" w:hAnsi="Consolas"/>
-                <w:b/>
-                <w:color w:val="0E7490"/>
-                <w:sz w:val="18"/>
-              </w:rPr>
-              <w:t>sampleRow(row)</w:t>
-            </w:r>
-          </w:p>
-        </w:tc>
-        <w:tc>
-          <w:tcPr>
-            <w:tcW w:type="dxa" w:w="2016"/>
-            <w:shd w:fill="FFFFFF"/>
-            <w:tcMar>
-              <w:top w:w="90" w:type="dxa"/>
-              <w:bottom w:w="90" w:type="dxa"/>
-              <w:left w:w="140" w:type="dxa"/>
-              <w:right w:w="140" w:type="dxa"/>
-            </w:tcMar>
-          </w:tcPr>
-          <w:p>
-            <w:pPr>
-              <w:jc w:val="left"/>
-            </w:pPr>
-            <w:r>
-              <w:rPr>
-                <w:rFonts w:ascii="Arial" w:hAnsi="Arial"/>
-                <w:b w:val="0"/>
-                <w:color w:val="1E293B"/>
-                <w:sz w:val="18"/>
-              </w:rPr>
-              <w:t>row: sqlite3.Row</w:t>
-            </w:r>
-          </w:p>
-        </w:tc>
-        <w:tc>
-          <w:tcPr>
-            <w:tcW w:type="dxa" w:w="1584"/>
-            <w:shd w:fill="FFFFFF"/>
-            <w:tcMar>
-              <w:top w:w="90" w:type="dxa"/>
-              <w:bottom w:w="90" w:type="dxa"/>
-              <w:left w:w="140" w:type="dxa"/>
-              <w:right w:w="140" w:type="dxa"/>
-            </w:tcMar>
-          </w:tcPr>
-          <w:p>
-            <w:pPr>
-              <w:jc w:val="left"/>
-            </w:pPr>
-            <w:r>
-              <w:rPr>
-                <w:rFonts w:ascii="Arial" w:hAnsi="Arial"/>
-                <w:b w:val="0"/>
-                <w:color w:val="1E293B"/>
-                <w:sz w:val="18"/>
-              </w:rPr>
-              <w:t>object</w:t>
-            </w:r>
-          </w:p>
-        </w:tc>
-        <w:tc>
-          <w:tcPr>
-            <w:tcW w:type="dxa" w:w="3888"/>
-            <w:shd w:fill="FFFFFF"/>
-            <w:tcMar>
-              <w:top w:w="90" w:type="dxa"/>
-              <w:bottom w:w="90" w:type="dxa"/>
-              <w:left w:w="140" w:type="dxa"/>
-              <w:right w:w="140" w:type="dxa"/>
-            </w:tcMar>
-          </w:tcPr>
-          <w:p>
-            <w:pPr>
-              <w:jc w:val="left"/>
-            </w:pPr>
-            <w:r>
-              <w:rPr>
-                <w:rFonts w:ascii="Arial" w:hAnsi="Arial"/>
-                <w:b w:val="0"/>
-                <w:color w:val="1E293B"/>
-                <w:sz w:val="18"/>
-              </w:rPr>
-              <w:t>Maps home sample collection orders with assigned phlebotomist info and live 5-stage timeline.</w:t>
-            </w:r>
-          </w:p>
-        </w:tc>
-      </w:tr>
-      <w:tr>
-        <w:tc>
-          <w:tcPr>
-            <w:tcW w:type="dxa" w:w="2592"/>
-            <w:shd w:fill="F8FAFC"/>
-            <w:tcMar>
-              <w:top w:w="90" w:type="dxa"/>
-              <w:bottom w:w="90" w:type="dxa"/>
-              <w:left w:w="140" w:type="dxa"/>
-              <w:right w:w="140" w:type="dxa"/>
-            </w:tcMar>
-          </w:tcPr>
-          <w:p>
-            <w:pPr>
-              <w:jc w:val="left"/>
-            </w:pPr>
-            <w:r>
-              <w:rPr>
-                <w:rFonts w:ascii="Consolas" w:hAnsi="Consolas"/>
-                <w:b/>
-                <w:color w:val="0E7490"/>
-                <w:sz w:val="18"/>
-              </w:rPr>
-              <w:t>GET /api/health</w:t>
-            </w:r>
-          </w:p>
-        </w:tc>
-        <w:tc>
-          <w:tcPr>
-            <w:tcW w:type="dxa" w:w="2016"/>
-            <w:shd w:fill="F8FAFC"/>
-            <w:tcMar>
-              <w:top w:w="90" w:type="dxa"/>
-              <w:bottom w:w="90" w:type="dxa"/>
-              <w:left w:w="140" w:type="dxa"/>
-              <w:right w:w="140" w:type="dxa"/>
-            </w:tcMar>
-          </w:tcPr>
-          <w:p>
-            <w:pPr>
-              <w:jc w:val="left"/>
-            </w:pPr>
-            <w:r>
-              <w:rPr>
-                <w:rFonts w:ascii="Arial" w:hAnsi="Arial"/>
-                <w:b w:val="0"/>
-                <w:color w:val="1E293B"/>
-                <w:sz w:val="18"/>
-              </w:rPr>
-              <w:t>None</w:t>
-            </w:r>
-          </w:p>
-        </w:tc>
-        <w:tc>
-          <w:tcPr>
-            <w:tcW w:type="dxa" w:w="1584"/>
-            <w:shd w:fill="F8FAFC"/>
-            <w:tcMar>
-              <w:top w:w="90" w:type="dxa"/>
-              <w:bottom w:w="90" w:type="dxa"/>
-              <w:left w:w="140" w:type="dxa"/>
-              <w:right w:w="140" w:type="dxa"/>
-            </w:tcMar>
-          </w:tcPr>
-          <w:p>
-            <w:pPr>
-              <w:jc w:val="left"/>
-            </w:pPr>
-            <w:r>
-              <w:rPr>
-                <w:rFonts w:ascii="Arial" w:hAnsi="Arial"/>
-                <w:b w:val="0"/>
-                <w:color w:val="1E293B"/>
-                <w:sz w:val="18"/>
-              </w:rPr>
-              <w:t>JSON</w:t>
-            </w:r>
-          </w:p>
-        </w:tc>
-        <w:tc>
-          <w:tcPr>
-            <w:tcW w:type="dxa" w:w="3888"/>
-            <w:shd w:fill="F8FAFC"/>
-            <w:tcMar>
-              <w:top w:w="90" w:type="dxa"/>
-              <w:bottom w:w="90" w:type="dxa"/>
-              <w:left w:w="140" w:type="dxa"/>
-              <w:right w:w="140" w:type="dxa"/>
-            </w:tcMar>
-          </w:tcPr>
-          <w:p>
-            <w:pPr>
-              <w:jc w:val="left"/>
-            </w:pPr>
-            <w:r>
-              <w:rPr>
-                <w:rFonts w:ascii="Arial" w:hAnsi="Arial"/>
-                <w:b w:val="0"/>
-                <w:color w:val="1E293B"/>
-                <w:sz w:val="18"/>
-              </w:rPr>
-              <w:t>Returns server health status, database name, and timestamp.</w:t>
-            </w:r>
-          </w:p>
-        </w:tc>
-      </w:tr>
-      <w:tr>
-        <w:tc>
-          <w:tcPr>
-            <w:tcW w:type="dxa" w:w="2592"/>
-            <w:shd w:fill="FFFFFF"/>
-            <w:tcMar>
-              <w:top w:w="90" w:type="dxa"/>
-              <w:bottom w:w="90" w:type="dxa"/>
-              <w:left w:w="140" w:type="dxa"/>
-              <w:right w:w="140" w:type="dxa"/>
-            </w:tcMar>
-          </w:tcPr>
-          <w:p>
-            <w:pPr>
-              <w:jc w:val="left"/>
-            </w:pPr>
-            <w:r>
-              <w:rPr>
-                <w:rFonts w:ascii="Consolas" w:hAnsi="Consolas"/>
-                <w:b/>
-                <w:color w:val="0E7490"/>
-                <w:sz w:val="18"/>
-              </w:rPr>
-              <w:t>GET /api/departments</w:t>
-            </w:r>
-          </w:p>
-        </w:tc>
-        <w:tc>
-          <w:tcPr>
-            <w:tcW w:type="dxa" w:w="2016"/>
-            <w:shd w:fill="FFFFFF"/>
-            <w:tcMar>
-              <w:top w:w="90" w:type="dxa"/>
-              <w:bottom w:w="90" w:type="dxa"/>
-              <w:left w:w="140" w:type="dxa"/>
-              <w:right w:w="140" w:type="dxa"/>
-            </w:tcMar>
-          </w:tcPr>
-          <w:p>
-            <w:pPr>
-              <w:jc w:val="left"/>
-            </w:pPr>
-            <w:r>
-              <w:rPr>
-                <w:rFonts w:ascii="Arial" w:hAnsi="Arial"/>
-                <w:b w:val="0"/>
-                <w:color w:val="1E293B"/>
-                <w:sz w:val="18"/>
-              </w:rPr>
-              <w:t>None</w:t>
-            </w:r>
-          </w:p>
-        </w:tc>
-        <w:tc>
-          <w:tcPr>
-            <w:tcW w:type="dxa" w:w="1584"/>
-            <w:shd w:fill="FFFFFF"/>
-            <w:tcMar>
-              <w:top w:w="90" w:type="dxa"/>
-              <w:bottom w:w="90" w:type="dxa"/>
-              <w:left w:w="140" w:type="dxa"/>
-              <w:right w:w="140" w:type="dxa"/>
-            </w:tcMar>
-          </w:tcPr>
-          <w:p>
-            <w:pPr>
-              <w:jc w:val="left"/>
-            </w:pPr>
-            <w:r>
-              <w:rPr>
-                <w:rFonts w:ascii="Arial" w:hAnsi="Arial"/>
-                <w:b w:val="0"/>
-                <w:color w:val="1E293B"/>
-                <w:sz w:val="18"/>
-              </w:rPr>
-              <w:t>JSON Array</w:t>
-            </w:r>
-          </w:p>
-        </w:tc>
-        <w:tc>
-          <w:tcPr>
-            <w:tcW w:type="dxa" w:w="3888"/>
-            <w:shd w:fill="FFFFFF"/>
-            <w:tcMar>
-              <w:top w:w="90" w:type="dxa"/>
-              <w:bottom w:w="90" w:type="dxa"/>
-              <w:left w:w="140" w:type="dxa"/>
-              <w:right w:w="140" w:type="dxa"/>
-            </w:tcMar>
-          </w:tcPr>
-          <w:p>
-            <w:pPr>
-              <w:jc w:val="left"/>
-            </w:pPr>
-            <w:r>
-              <w:rPr>
-                <w:rFonts w:ascii="Arial" w:hAnsi="Arial"/>
-                <w:b w:val="0"/>
-                <w:color w:val="1E293B"/>
-                <w:sz w:val="18"/>
-              </w:rPr>
-              <w:t>Returns all 8 hospital departments with doctor count and location.</w:t>
-            </w:r>
-          </w:p>
-        </w:tc>
-      </w:tr>
-      <w:tr>
-        <w:tc>
-          <w:tcPr>
-            <w:tcW w:type="dxa" w:w="2592"/>
-            <w:shd w:fill="F8FAFC"/>
-            <w:tcMar>
-              <w:top w:w="90" w:type="dxa"/>
-              <w:bottom w:w="90" w:type="dxa"/>
-              <w:left w:w="140" w:type="dxa"/>
-              <w:right w:w="140" w:type="dxa"/>
-            </w:tcMar>
-          </w:tcPr>
-          <w:p>
-            <w:pPr>
-              <w:jc w:val="left"/>
-            </w:pPr>
-            <w:r>
-              <w:rPr>
-                <w:rFonts w:ascii="Consolas" w:hAnsi="Consolas"/>
-                <w:b/>
-                <w:color w:val="0E7490"/>
-                <w:sz w:val="18"/>
-              </w:rPr>
-              <w:t>POST /api/departments</w:t>
-            </w:r>
-          </w:p>
-        </w:tc>
-        <w:tc>
-          <w:tcPr>
-            <w:tcW w:type="dxa" w:w="2016"/>
-            <w:shd w:fill="F8FAFC"/>
-            <w:tcMar>
-              <w:top w:w="90" w:type="dxa"/>
-              <w:bottom w:w="90" w:type="dxa"/>
-              <w:left w:w="140" w:type="dxa"/>
-              <w:right w:w="140" w:type="dxa"/>
-            </w:tcMar>
-          </w:tcPr>
-          <w:p>
-            <w:pPr>
-              <w:jc w:val="left"/>
-            </w:pPr>
-            <w:r>
-              <w:rPr>
-                <w:rFonts w:ascii="Arial" w:hAnsi="Arial"/>
-                <w:b w:val="0"/>
-                <w:color w:val="1E293B"/>
-                <w:sz w:val="18"/>
-              </w:rPr>
-              <w:t>Body: Dept Data</w:t>
-            </w:r>
-          </w:p>
-        </w:tc>
-        <w:tc>
-          <w:tcPr>
-            <w:tcW w:type="dxa" w:w="1584"/>
-            <w:shd w:fill="F8FAFC"/>
-            <w:tcMar>
-              <w:top w:w="90" w:type="dxa"/>
-              <w:bottom w:w="90" w:type="dxa"/>
-              <w:left w:w="140" w:type="dxa"/>
-              <w:right w:w="140" w:type="dxa"/>
-            </w:tcMar>
-          </w:tcPr>
-          <w:p>
-            <w:pPr>
-              <w:jc w:val="left"/>
-            </w:pPr>
-            <w:r>
-              <w:rPr>
-                <w:rFonts w:ascii="Arial" w:hAnsi="Arial"/>
-                <w:b w:val="0"/>
-                <w:color w:val="1E293B"/>
-                <w:sz w:val="18"/>
-              </w:rPr>
-              <w:t>JSON Object</w:t>
-            </w:r>
-          </w:p>
-        </w:tc>
-        <w:tc>
-          <w:tcPr>
-            <w:tcW w:type="dxa" w:w="3888"/>
-            <w:shd w:fill="F8FAFC"/>
-            <w:tcMar>
-              <w:top w:w="90" w:type="dxa"/>
-              <w:bottom w:w="90" w:type="dxa"/>
-              <w:left w:w="140" w:type="dxa"/>
-              <w:right w:w="140" w:type="dxa"/>
-            </w:tcMar>
-          </w:tcPr>
-          <w:p>
-            <w:pPr>
-              <w:jc w:val="left"/>
-            </w:pPr>
-            <w:r>
-              <w:rPr>
-                <w:rFonts w:ascii="Arial" w:hAnsi="Arial"/>
-                <w:b w:val="0"/>
-                <w:color w:val="1E293B"/>
-                <w:sz w:val="18"/>
-              </w:rPr>
-              <w:t>Creates a new department in better-sqlite3 database.</w:t>
-            </w:r>
-          </w:p>
-        </w:tc>
-      </w:tr>
-      <w:tr>
-        <w:tc>
-          <w:tcPr>
-            <w:tcW w:type="dxa" w:w="2592"/>
-            <w:shd w:fill="FFFFFF"/>
-            <w:tcMar>
-              <w:top w:w="90" w:type="dxa"/>
-              <w:bottom w:w="90" w:type="dxa"/>
-              <w:left w:w="140" w:type="dxa"/>
-              <w:right w:w="140" w:type="dxa"/>
-            </w:tcMar>
-          </w:tcPr>
-          <w:p>
-            <w:pPr>
-              <w:jc w:val="left"/>
-            </w:pPr>
-            <w:r>
-              <w:rPr>
-                <w:rFonts w:ascii="Consolas" w:hAnsi="Consolas"/>
-                <w:b/>
-                <w:color w:val="0E7490"/>
-                <w:sz w:val="18"/>
-              </w:rPr>
-              <w:t>GET /api/doctors</w:t>
-            </w:r>
-          </w:p>
-        </w:tc>
-        <w:tc>
-          <w:tcPr>
-            <w:tcW w:type="dxa" w:w="2016"/>
-            <w:shd w:fill="FFFFFF"/>
-            <w:tcMar>
-              <w:top w:w="90" w:type="dxa"/>
-              <w:bottom w:w="90" w:type="dxa"/>
-              <w:left w:w="140" w:type="dxa"/>
-              <w:right w:w="140" w:type="dxa"/>
-            </w:tcMar>
-          </w:tcPr>
-          <w:p>
-            <w:pPr>
-              <w:jc w:val="left"/>
-            </w:pPr>
-            <w:r>
-              <w:rPr>
-                <w:rFonts w:ascii="Arial" w:hAnsi="Arial"/>
-                <w:b w:val="0"/>
-                <w:color w:val="1E293B"/>
-                <w:sz w:val="18"/>
-              </w:rPr>
-              <w:t>Query: department?</w:t>
-            </w:r>
-          </w:p>
-        </w:tc>
-        <w:tc>
-          <w:tcPr>
-            <w:tcW w:type="dxa" w:w="1584"/>
-            <w:shd w:fill="FFFFFF"/>
-            <w:tcMar>
-              <w:top w:w="90" w:type="dxa"/>
-              <w:bottom w:w="90" w:type="dxa"/>
-              <w:left w:w="140" w:type="dxa"/>
-              <w:right w:w="140" w:type="dxa"/>
-            </w:tcMar>
-          </w:tcPr>
-          <w:p>
-            <w:pPr>
-              <w:jc w:val="left"/>
-            </w:pPr>
-            <w:r>
-              <w:rPr>
-                <w:rFonts w:ascii="Arial" w:hAnsi="Arial"/>
-                <w:b w:val="0"/>
-                <w:color w:val="1E293B"/>
-                <w:sz w:val="18"/>
-              </w:rPr>
-              <w:t>JSON Array</w:t>
-            </w:r>
-          </w:p>
-        </w:tc>
-        <w:tc>
-          <w:tcPr>
-            <w:tcW w:type="dxa" w:w="3888"/>
-            <w:shd w:fill="FFFFFF"/>
-            <w:tcMar>
-              <w:top w:w="90" w:type="dxa"/>
-              <w:bottom w:w="90" w:type="dxa"/>
-              <w:left w:w="140" w:type="dxa"/>
-              <w:right w:w="140" w:type="dxa"/>
-            </w:tcMar>
-          </w:tcPr>
-          <w:p>
-            <w:pPr>
-              <w:jc w:val="left"/>
-            </w:pPr>
-            <w:r>
-              <w:rPr>
-                <w:rFonts w:ascii="Arial" w:hAnsi="Arial"/>
-                <w:b w:val="0"/>
-                <w:color w:val="1E293B"/>
-                <w:sz w:val="18"/>
-              </w:rPr>
-              <w:t>Fetches list of doctors with optional department filter.</w:t>
-            </w:r>
-          </w:p>
-        </w:tc>
-      </w:tr>
-      <w:tr>
-        <w:tc>
-          <w:tcPr>
-            <w:tcW w:type="dxa" w:w="2592"/>
-            <w:shd w:fill="F8FAFC"/>
-            <w:tcMar>
-              <w:top w:w="90" w:type="dxa"/>
-              <w:bottom w:w="90" w:type="dxa"/>
-              <w:left w:w="140" w:type="dxa"/>
-              <w:right w:w="140" w:type="dxa"/>
-            </w:tcMar>
-          </w:tcPr>
-          <w:p>
-            <w:pPr>
-              <w:jc w:val="left"/>
-            </w:pPr>
-            <w:r>
-              <w:rPr>
-                <w:rFonts w:ascii="Consolas" w:hAnsi="Consolas"/>
-                <w:b/>
-                <w:color w:val="0E7490"/>
-                <w:sz w:val="18"/>
-              </w:rPr>
-              <w:t>GET /api/doctors/:id</w:t>
-            </w:r>
-          </w:p>
-        </w:tc>
-        <w:tc>
-          <w:tcPr>
-            <w:tcW w:type="dxa" w:w="2016"/>
-            <w:shd w:fill="F8FAFC"/>
-            <w:tcMar>
-              <w:top w:w="90" w:type="dxa"/>
-              <w:bottom w:w="90" w:type="dxa"/>
-              <w:left w:w="140" w:type="dxa"/>
-              <w:right w:w="140" w:type="dxa"/>
-            </w:tcMar>
-          </w:tcPr>
-          <w:p>
-            <w:pPr>
-              <w:jc w:val="left"/>
-            </w:pPr>
-            <w:r>
-              <w:rPr>
-                <w:rFonts w:ascii="Arial" w:hAnsi="Arial"/>
-                <w:b w:val="0"/>
-                <w:color w:val="1E293B"/>
-                <w:sz w:val="18"/>
-              </w:rPr>
-              <w:t>Param: id</w:t>
-            </w:r>
-          </w:p>
-        </w:tc>
-        <w:tc>
-          <w:tcPr>
-            <w:tcW w:type="dxa" w:w="1584"/>
-            <w:shd w:fill="F8FAFC"/>
-            <w:tcMar>
-              <w:top w:w="90" w:type="dxa"/>
-              <w:bottom w:w="90" w:type="dxa"/>
-              <w:left w:w="140" w:type="dxa"/>
-              <w:right w:w="140" w:type="dxa"/>
-            </w:tcMar>
-          </w:tcPr>
-          <w:p>
-            <w:pPr>
-              <w:jc w:val="left"/>
-            </w:pPr>
-            <w:r>
-              <w:rPr>
-                <w:rFonts w:ascii="Arial" w:hAnsi="Arial"/>
-                <w:b w:val="0"/>
-                <w:color w:val="1E293B"/>
-                <w:sz w:val="18"/>
-              </w:rPr>
-              <w:t>JSON Object</w:t>
-            </w:r>
-          </w:p>
-        </w:tc>
-        <w:tc>
-          <w:tcPr>
-            <w:tcW w:type="dxa" w:w="3888"/>
-            <w:shd w:fill="F8FAFC"/>
-            <w:tcMar>
-              <w:top w:w="90" w:type="dxa"/>
-              <w:bottom w:w="90" w:type="dxa"/>
-              <w:left w:w="140" w:type="dxa"/>
-              <w:right w:w="140" w:type="dxa"/>
-            </w:tcMar>
-          </w:tcPr>
-          <w:p>
-            <w:pPr>
-              <w:jc w:val="left"/>
-            </w:pPr>
-            <w:r>
-              <w:rPr>
-                <w:rFonts w:ascii="Arial" w:hAnsi="Arial"/>
-                <w:b w:val="0"/>
-                <w:color w:val="1E293B"/>
-                <w:sz w:val="18"/>
-              </w:rPr>
-              <w:t>Fetches full profile, reviews, and slots for a single doctor.</w:t>
-            </w:r>
-          </w:p>
-        </w:tc>
-      </w:tr>
-      <w:tr>
-        <w:tc>
-          <w:tcPr>
-            <w:tcW w:type="dxa" w:w="2592"/>
-            <w:shd w:fill="FFFFFF"/>
-            <w:tcMar>
-              <w:top w:w="90" w:type="dxa"/>
-              <w:bottom w:w="90" w:type="dxa"/>
-              <w:left w:w="140" w:type="dxa"/>
-              <w:right w:w="140" w:type="dxa"/>
-            </w:tcMar>
-          </w:tcPr>
-          <w:p>
-            <w:pPr>
-              <w:jc w:val="left"/>
-            </w:pPr>
-            <w:r>
-              <w:rPr>
-                <w:rFonts w:ascii="Consolas" w:hAnsi="Consolas"/>
-                <w:b/>
-                <w:color w:val="0E7490"/>
-                <w:sz w:val="18"/>
-              </w:rPr>
-              <w:t>POST /api/doctors</w:t>
-            </w:r>
-          </w:p>
-        </w:tc>
-        <w:tc>
-          <w:tcPr>
-            <w:tcW w:type="dxa" w:w="2016"/>
-            <w:shd w:fill="FFFFFF"/>
-            <w:tcMar>
-              <w:top w:w="90" w:type="dxa"/>
-              <w:bottom w:w="90" w:type="dxa"/>
-              <w:left w:w="140" w:type="dxa"/>
-              <w:right w:w="140" w:type="dxa"/>
-            </w:tcMar>
-          </w:tcPr>
-          <w:p>
-            <w:pPr>
-              <w:jc w:val="left"/>
-            </w:pPr>
-            <w:r>
-              <w:rPr>
-                <w:rFonts w:ascii="Arial" w:hAnsi="Arial"/>
-                <w:b w:val="0"/>
-                <w:color w:val="1E293B"/>
-                <w:sz w:val="18"/>
-              </w:rPr>
-              <w:t>Body: Doctor Data</w:t>
-            </w:r>
-          </w:p>
-        </w:tc>
-        <w:tc>
-          <w:tcPr>
-            <w:tcW w:type="dxa" w:w="1584"/>
-            <w:shd w:fill="FFFFFF"/>
-            <w:tcMar>
-              <w:top w:w="90" w:type="dxa"/>
-              <w:bottom w:w="90" w:type="dxa"/>
-              <w:left w:w="140" w:type="dxa"/>
-              <w:right w:w="140" w:type="dxa"/>
-            </w:tcMar>
-          </w:tcPr>
-          <w:p>
-            <w:pPr>
-              <w:jc w:val="left"/>
-            </w:pPr>
-            <w:r>
-              <w:rPr>
-                <w:rFonts w:ascii="Arial" w:hAnsi="Arial"/>
-                <w:b w:val="0"/>
-                <w:color w:val="1E293B"/>
-                <w:sz w:val="18"/>
-              </w:rPr>
-              <w:t>JSON Object</w:t>
-            </w:r>
-          </w:p>
-        </w:tc>
-        <w:tc>
-          <w:tcPr>
-            <w:tcW w:type="dxa" w:w="3888"/>
-            <w:shd w:fill="FFFFFF"/>
-            <w:tcMar>
-              <w:top w:w="90" w:type="dxa"/>
-              <w:bottom w:w="90" w:type="dxa"/>
-              <w:left w:w="140" w:type="dxa"/>
-              <w:right w:w="140" w:type="dxa"/>
-            </w:tcMar>
-          </w:tcPr>
-          <w:p>
-            <w:pPr>
-              <w:jc w:val="left"/>
-            </w:pPr>
-            <w:r>
-              <w:rPr>
-                <w:rFonts w:ascii="Arial" w:hAnsi="Arial"/>
-                <w:b w:val="0"/>
-                <w:color w:val="1E293B"/>
-                <w:sz w:val="18"/>
-              </w:rPr>
-              <w:t>Adds a new doctor to the roster with verified credentials.</w:t>
-            </w:r>
-          </w:p>
-        </w:tc>
-      </w:tr>
-      <w:tr>
-        <w:tc>
-          <w:tcPr>
-            <w:tcW w:type="dxa" w:w="2592"/>
-            <w:shd w:fill="F8FAFC"/>
-            <w:tcMar>
-              <w:top w:w="90" w:type="dxa"/>
-              <w:bottom w:w="90" w:type="dxa"/>
-              <w:left w:w="140" w:type="dxa"/>
-              <w:right w:w="140" w:type="dxa"/>
-            </w:tcMar>
-          </w:tcPr>
-          <w:p>
-            <w:pPr>
-              <w:jc w:val="left"/>
-            </w:pPr>
-            <w:r>
-              <w:rPr>
-                <w:rFonts w:ascii="Consolas" w:hAnsi="Consolas"/>
-                <w:b/>
-                <w:color w:val="0E7490"/>
-                <w:sz w:val="18"/>
-              </w:rPr>
-              <w:t>PUT /api/doctors/:id</w:t>
-            </w:r>
-          </w:p>
-        </w:tc>
-        <w:tc>
-          <w:tcPr>
-            <w:tcW w:type="dxa" w:w="2016"/>
-            <w:shd w:fill="F8FAFC"/>
-            <w:tcMar>
-              <w:top w:w="90" w:type="dxa"/>
-              <w:bottom w:w="90" w:type="dxa"/>
-              <w:left w:w="140" w:type="dxa"/>
-              <w:right w:w="140" w:type="dxa"/>
-            </w:tcMar>
-          </w:tcPr>
-          <w:p>
-            <w:pPr>
-              <w:jc w:val="left"/>
-            </w:pPr>
-            <w:r>
-              <w:rPr>
-                <w:rFonts w:ascii="Arial" w:hAnsi="Arial"/>
-                <w:b w:val="0"/>
-                <w:color w:val="1E293B"/>
-                <w:sz w:val="18"/>
-              </w:rPr>
-              <w:t>Param: id, Body: Updates</w:t>
-            </w:r>
-          </w:p>
-        </w:tc>
-        <w:tc>
-          <w:tcPr>
-            <w:tcW w:type="dxa" w:w="1584"/>
-            <w:shd w:fill="F8FAFC"/>
-            <w:tcMar>
-              <w:top w:w="90" w:type="dxa"/>
-              <w:bottom w:w="90" w:type="dxa"/>
-              <w:left w:w="140" w:type="dxa"/>
-              <w:right w:w="140" w:type="dxa"/>
-            </w:tcMar>
-          </w:tcPr>
-          <w:p>
-            <w:pPr>
-              <w:jc w:val="left"/>
-            </w:pPr>
-            <w:r>
-              <w:rPr>
-                <w:rFonts w:ascii="Arial" w:hAnsi="Arial"/>
-                <w:b w:val="0"/>
-                <w:color w:val="1E293B"/>
-                <w:sz w:val="18"/>
-              </w:rPr>
-              <w:t>JSON Object</w:t>
-            </w:r>
-          </w:p>
-        </w:tc>
-        <w:tc>
-          <w:tcPr>
-            <w:tcW w:type="dxa" w:w="3888"/>
-            <w:shd w:fill="F8FAFC"/>
-            <w:tcMar>
-              <w:top w:w="90" w:type="dxa"/>
-              <w:bottom w:w="90" w:type="dxa"/>
-              <w:left w:w="140" w:type="dxa"/>
-              <w:right w:w="140" w:type="dxa"/>
-            </w:tcMar>
-          </w:tcPr>
-          <w:p>
-            <w:pPr>
-              <w:jc w:val="left"/>
-            </w:pPr>
-            <w:r>
-              <w:rPr>
-                <w:rFonts w:ascii="Arial" w:hAnsi="Arial"/>
-                <w:b w:val="0"/>
-                <w:color w:val="1E293B"/>
-                <w:sz w:val="18"/>
-              </w:rPr>
-              <w:t>Updates doctor fees, room number, slots, or bio.</w:t>
-            </w:r>
-          </w:p>
-        </w:tc>
-      </w:tr>
-      <w:tr>
-        <w:tc>
-          <w:tcPr>
-            <w:tcW w:type="dxa" w:w="2592"/>
-            <w:shd w:fill="FFFFFF"/>
-            <w:tcMar>
-              <w:top w:w="90" w:type="dxa"/>
-              <w:bottom w:w="90" w:type="dxa"/>
-              <w:left w:w="140" w:type="dxa"/>
-              <w:right w:w="140" w:type="dxa"/>
-            </w:tcMar>
-          </w:tcPr>
-          <w:p>
-            <w:pPr>
-              <w:jc w:val="left"/>
-            </w:pPr>
-            <w:r>
-              <w:rPr>
-                <w:rFonts w:ascii="Consolas" w:hAnsi="Consolas"/>
-                <w:b/>
-                <w:color w:val="0E7490"/>
-                <w:sz w:val="18"/>
-              </w:rPr>
-              <w:t>GET /api/patients/current</w:t>
-            </w:r>
-          </w:p>
-        </w:tc>
-        <w:tc>
-          <w:tcPr>
-            <w:tcW w:type="dxa" w:w="2016"/>
-            <w:shd w:fill="FFFFFF"/>
-            <w:tcMar>
-              <w:top w:w="90" w:type="dxa"/>
-              <w:bottom w:w="90" w:type="dxa"/>
-              <w:left w:w="140" w:type="dxa"/>
-              <w:right w:w="140" w:type="dxa"/>
-            </w:tcMar>
-          </w:tcPr>
-          <w:p>
-            <w:pPr>
-              <w:jc w:val="left"/>
-            </w:pPr>
-            <w:r>
-              <w:rPr>
-                <w:rFonts w:ascii="Arial" w:hAnsi="Arial"/>
-                <w:b w:val="0"/>
-                <w:color w:val="1E293B"/>
-                <w:sz w:val="18"/>
-              </w:rPr>
-              <w:t>None</w:t>
-            </w:r>
-          </w:p>
-        </w:tc>
-        <w:tc>
-          <w:tcPr>
-            <w:tcW w:type="dxa" w:w="1584"/>
-            <w:shd w:fill="FFFFFF"/>
-            <w:tcMar>
-              <w:top w:w="90" w:type="dxa"/>
-              <w:bottom w:w="90" w:type="dxa"/>
-              <w:left w:w="140" w:type="dxa"/>
-              <w:right w:w="140" w:type="dxa"/>
-            </w:tcMar>
-          </w:tcPr>
-          <w:p>
-            <w:pPr>
-              <w:jc w:val="left"/>
-            </w:pPr>
-            <w:r>
-              <w:rPr>
-                <w:rFonts w:ascii="Arial" w:hAnsi="Arial"/>
-                <w:b w:val="0"/>
-                <w:color w:val="1E293B"/>
-                <w:sz w:val="18"/>
-              </w:rPr>
-              <w:t>JSON Object</w:t>
-            </w:r>
-          </w:p>
-        </w:tc>
-        <w:tc>
-          <w:tcPr>
-            <w:tcW w:type="dxa" w:w="3888"/>
-            <w:shd w:fill="FFFFFF"/>
-            <w:tcMar>
-              <w:top w:w="90" w:type="dxa"/>
-              <w:bottom w:w="90" w:type="dxa"/>
-              <w:left w:w="140" w:type="dxa"/>
-              <w:right w:w="140" w:type="dxa"/>
-            </w:tcMar>
-          </w:tcPr>
-          <w:p>
-            <w:pPr>
-              <w:jc w:val="left"/>
-            </w:pPr>
-            <w:r>
-              <w:rPr>
-                <w:rFonts w:ascii="Arial" w:hAnsi="Arial"/>
-                <w:b w:val="0"/>
-                <w:color w:val="1E293B"/>
-                <w:sz w:val="18"/>
-              </w:rPr>
-              <w:t>Fetches logged-in patient demographic and clinical profile.</w:t>
-            </w:r>
-          </w:p>
-        </w:tc>
-      </w:tr>
-      <w:tr>
-        <w:tc>
-          <w:tcPr>
-            <w:tcW w:type="dxa" w:w="2592"/>
-            <w:shd w:fill="F8FAFC"/>
-            <w:tcMar>
-              <w:top w:w="90" w:type="dxa"/>
-              <w:bottom w:w="90" w:type="dxa"/>
-              <w:left w:w="140" w:type="dxa"/>
-              <w:right w:w="140" w:type="dxa"/>
-            </w:tcMar>
-          </w:tcPr>
-          <w:p>
-            <w:pPr>
-              <w:jc w:val="left"/>
-            </w:pPr>
-            <w:r>
-              <w:rPr>
-                <w:rFonts w:ascii="Consolas" w:hAnsi="Consolas"/>
-                <w:b/>
-                <w:color w:val="0E7490"/>
-                <w:sz w:val="18"/>
-              </w:rPr>
-              <w:t>PUT /api/patients/current</w:t>
-            </w:r>
-          </w:p>
-        </w:tc>
-        <w:tc>
-          <w:tcPr>
-            <w:tcW w:type="dxa" w:w="2016"/>
-            <w:shd w:fill="F8FAFC"/>
-            <w:tcMar>
-              <w:top w:w="90" w:type="dxa"/>
-              <w:bottom w:w="90" w:type="dxa"/>
-              <w:left w:w="140" w:type="dxa"/>
-              <w:right w:w="140" w:type="dxa"/>
-            </w:tcMar>
-          </w:tcPr>
-          <w:p>
-            <w:pPr>
-              <w:jc w:val="left"/>
-            </w:pPr>
-            <w:r>
-              <w:rPr>
-                <w:rFonts w:ascii="Arial" w:hAnsi="Arial"/>
-                <w:b w:val="0"/>
-                <w:color w:val="1E293B"/>
-                <w:sz w:val="18"/>
-              </w:rPr>
-              <w:t>Body: Profile Data</w:t>
-            </w:r>
-          </w:p>
-        </w:tc>
-        <w:tc>
-          <w:tcPr>
-            <w:tcW w:type="dxa" w:w="1584"/>
-            <w:shd w:fill="F8FAFC"/>
-            <w:tcMar>
-              <w:top w:w="90" w:type="dxa"/>
-              <w:bottom w:w="90" w:type="dxa"/>
-              <w:left w:w="140" w:type="dxa"/>
-              <w:right w:w="140" w:type="dxa"/>
-            </w:tcMar>
-          </w:tcPr>
-          <w:p>
-            <w:pPr>
-              <w:jc w:val="left"/>
-            </w:pPr>
-            <w:r>
-              <w:rPr>
-                <w:rFonts w:ascii="Arial" w:hAnsi="Arial"/>
-                <w:b w:val="0"/>
-                <w:color w:val="1E293B"/>
-                <w:sz w:val="18"/>
-              </w:rPr>
-              <w:t>JSON Object</w:t>
-            </w:r>
-          </w:p>
-        </w:tc>
-        <w:tc>
-          <w:tcPr>
-            <w:tcW w:type="dxa" w:w="3888"/>
-            <w:shd w:fill="F8FAFC"/>
-            <w:tcMar>
-              <w:top w:w="90" w:type="dxa"/>
-              <w:bottom w:w="90" w:type="dxa"/>
-              <w:left w:w="140" w:type="dxa"/>
-              <w:right w:w="140" w:type="dxa"/>
-            </w:tcMar>
-          </w:tcPr>
-          <w:p>
-            <w:pPr>
-              <w:jc w:val="left"/>
-            </w:pPr>
-            <w:r>
-              <w:rPr>
-                <w:rFonts w:ascii="Arial" w:hAnsi="Arial"/>
-                <w:b w:val="0"/>
-                <w:color w:val="1E293B"/>
-                <w:sz w:val="18"/>
-              </w:rPr>
-              <w:t>Updates patient contact info, allergies, and chronic conditions.</w:t>
-            </w:r>
-          </w:p>
-        </w:tc>
-      </w:tr>
-      <w:tr>
-        <w:tc>
-          <w:tcPr>
-            <w:tcW w:type="dxa" w:w="2592"/>
-            <w:shd w:fill="FFFFFF"/>
-            <w:tcMar>
-              <w:top w:w="90" w:type="dxa"/>
-              <w:bottom w:w="90" w:type="dxa"/>
-              <w:left w:w="140" w:type="dxa"/>
-              <w:right w:w="140" w:type="dxa"/>
-            </w:tcMar>
-          </w:tcPr>
-          <w:p>
-            <w:pPr>
-              <w:jc w:val="left"/>
-            </w:pPr>
-            <w:r>
-              <w:rPr>
-                <w:rFonts w:ascii="Consolas" w:hAnsi="Consolas"/>
-                <w:b/>
-                <w:color w:val="0E7490"/>
-                <w:sz w:val="18"/>
-              </w:rPr>
-              <w:t>GET /api/appointments</w:t>
-            </w:r>
-          </w:p>
-        </w:tc>
-        <w:tc>
-          <w:tcPr>
-            <w:tcW w:type="dxa" w:w="2016"/>
-            <w:shd w:fill="FFFFFF"/>
-            <w:tcMar>
-              <w:top w:w="90" w:type="dxa"/>
-              <w:bottom w:w="90" w:type="dxa"/>
-              <w:left w:w="140" w:type="dxa"/>
-              <w:right w:w="140" w:type="dxa"/>
-            </w:tcMar>
-          </w:tcPr>
-          <w:p>
-            <w:pPr>
-              <w:jc w:val="left"/>
-            </w:pPr>
-            <w:r>
-              <w:rPr>
-                <w:rFonts w:ascii="Arial" w:hAnsi="Arial"/>
-                <w:b w:val="0"/>
-                <w:color w:val="1E293B"/>
-                <w:sz w:val="18"/>
-              </w:rPr>
-              <w:t>Query: patientId?, doctorId?</w:t>
-            </w:r>
-          </w:p>
-        </w:tc>
-        <w:tc>
-          <w:tcPr>
-            <w:tcW w:type="dxa" w:w="1584"/>
-            <w:shd w:fill="FFFFFF"/>
-            <w:tcMar>
-              <w:top w:w="90" w:type="dxa"/>
-              <w:bottom w:w="90" w:type="dxa"/>
-              <w:left w:w="140" w:type="dxa"/>
-              <w:right w:w="140" w:type="dxa"/>
-            </w:tcMar>
-          </w:tcPr>
-          <w:p>
-            <w:pPr>
-              <w:jc w:val="left"/>
-            </w:pPr>
-            <w:r>
-              <w:rPr>
-                <w:rFonts w:ascii="Arial" w:hAnsi="Arial"/>
-                <w:b w:val="0"/>
-                <w:color w:val="1E293B"/>
-                <w:sz w:val="18"/>
-              </w:rPr>
-              <w:t>JSON Array</w:t>
-            </w:r>
-          </w:p>
-        </w:tc>
-        <w:tc>
-          <w:tcPr>
-            <w:tcW w:type="dxa" w:w="3888"/>
-            <w:shd w:fill="FFFFFF"/>
-            <w:tcMar>
-              <w:top w:w="90" w:type="dxa"/>
-              <w:bottom w:w="90" w:type="dxa"/>
-              <w:left w:w="140" w:type="dxa"/>
-              <w:right w:w="140" w:type="dxa"/>
-            </w:tcMar>
-          </w:tcPr>
-          <w:p>
-            <w:pPr>
-              <w:jc w:val="left"/>
-            </w:pPr>
-            <w:r>
-              <w:rPr>
-                <w:rFonts w:ascii="Arial" w:hAnsi="Arial"/>
-                <w:b w:val="0"/>
-                <w:color w:val="1E293B"/>
-                <w:sz w:val="18"/>
-              </w:rPr>
-              <w:t>Fetches appointment list with doctor or patient filtering.</w:t>
-            </w:r>
-          </w:p>
-        </w:tc>
-      </w:tr>
-      <w:tr>
-        <w:tc>
-          <w:tcPr>
-            <w:tcW w:type="dxa" w:w="2592"/>
-            <w:shd w:fill="F8FAFC"/>
-            <w:tcMar>
-              <w:top w:w="90" w:type="dxa"/>
-              <w:bottom w:w="90" w:type="dxa"/>
-              <w:left w:w="140" w:type="dxa"/>
-              <w:right w:w="140" w:type="dxa"/>
-            </w:tcMar>
-          </w:tcPr>
-          <w:p>
-            <w:pPr>
-              <w:jc w:val="left"/>
-            </w:pPr>
-            <w:r>
-              <w:rPr>
-                <w:rFonts w:ascii="Consolas" w:hAnsi="Consolas"/>
-                <w:b/>
-                <w:color w:val="0E7490"/>
-                <w:sz w:val="18"/>
-              </w:rPr>
-              <w:t>POST /api/appointments</w:t>
-            </w:r>
-          </w:p>
-        </w:tc>
-        <w:tc>
-          <w:tcPr>
-            <w:tcW w:type="dxa" w:w="2016"/>
-            <w:shd w:fill="F8FAFC"/>
-            <w:tcMar>
-              <w:top w:w="90" w:type="dxa"/>
-              <w:bottom w:w="90" w:type="dxa"/>
-              <w:left w:w="140" w:type="dxa"/>
-              <w:right w:w="140" w:type="dxa"/>
-            </w:tcMar>
-          </w:tcPr>
-          <w:p>
-            <w:pPr>
-              <w:jc w:val="left"/>
-            </w:pPr>
-            <w:r>
-              <w:rPr>
-                <w:rFonts w:ascii="Arial" w:hAnsi="Arial"/>
-                <w:b w:val="0"/>
-                <w:color w:val="1E293B"/>
-                <w:sz w:val="18"/>
-              </w:rPr>
-              <w:t>Body: Booking Data</w:t>
-            </w:r>
-          </w:p>
-        </w:tc>
-        <w:tc>
-          <w:tcPr>
-            <w:tcW w:type="dxa" w:w="1584"/>
-            <w:shd w:fill="F8FAFC"/>
-            <w:tcMar>
-              <w:top w:w="90" w:type="dxa"/>
-              <w:bottom w:w="90" w:type="dxa"/>
-              <w:left w:w="140" w:type="dxa"/>
-              <w:right w:w="140" w:type="dxa"/>
-            </w:tcMar>
-          </w:tcPr>
-          <w:p>
-            <w:pPr>
-              <w:jc w:val="left"/>
-            </w:pPr>
-            <w:r>
-              <w:rPr>
-                <w:rFonts w:ascii="Arial" w:hAnsi="Arial"/>
-                <w:b w:val="0"/>
-                <w:color w:val="1E293B"/>
-                <w:sz w:val="18"/>
-              </w:rPr>
-              <w:t>JSON Object</w:t>
-            </w:r>
-          </w:p>
-        </w:tc>
-        <w:tc>
-          <w:tcPr>
-            <w:tcW w:type="dxa" w:w="3888"/>
-            <w:shd w:fill="F8FAFC"/>
-            <w:tcMar>
-              <w:top w:w="90" w:type="dxa"/>
-              <w:bottom w:w="90" w:type="dxa"/>
-              <w:left w:w="140" w:type="dxa"/>
-              <w:right w:w="140" w:type="dxa"/>
-            </w:tcMar>
-          </w:tcPr>
-          <w:p>
-            <w:pPr>
-              <w:jc w:val="left"/>
-            </w:pPr>
-            <w:r>
-              <w:rPr>
-                <w:rFonts w:ascii="Arial" w:hAnsi="Arial"/>
-                <w:b w:val="0"/>
-                <w:color w:val="1E293B"/>
-                <w:sz w:val="18"/>
-              </w:rPr>
-              <w:t>Books new appointment and assigns token number.</w:t>
-            </w:r>
-          </w:p>
-        </w:tc>
-      </w:tr>
-      <w:tr>
-        <w:tc>
-          <w:tcPr>
-            <w:tcW w:type="dxa" w:w="2592"/>
-            <w:shd w:fill="FFFFFF"/>
-            <w:tcMar>
-              <w:top w:w="90" w:type="dxa"/>
-              <w:bottom w:w="90" w:type="dxa"/>
-              <w:left w:w="140" w:type="dxa"/>
-              <w:right w:w="140" w:type="dxa"/>
-            </w:tcMar>
-          </w:tcPr>
-          <w:p>
-            <w:pPr>
-              <w:jc w:val="left"/>
-            </w:pPr>
-            <w:r>
-              <w:rPr>
-                <w:rFonts w:ascii="Consolas" w:hAnsi="Consolas"/>
-                <w:b/>
-                <w:color w:val="0E7490"/>
-                <w:sz w:val="18"/>
-              </w:rPr>
-              <w:t>PATCH /api/appointments/:id/status</w:t>
-            </w:r>
-          </w:p>
-        </w:tc>
-        <w:tc>
-          <w:tcPr>
-            <w:tcW w:type="dxa" w:w="2016"/>
-            <w:shd w:fill="FFFFFF"/>
-            <w:tcMar>
-              <w:top w:w="90" w:type="dxa"/>
-              <w:bottom w:w="90" w:type="dxa"/>
-              <w:left w:w="140" w:type="dxa"/>
-              <w:right w:w="140" w:type="dxa"/>
-            </w:tcMar>
-          </w:tcPr>
-          <w:p>
-            <w:pPr>
-              <w:jc w:val="left"/>
-            </w:pPr>
-            <w:r>
-              <w:rPr>
-                <w:rFonts w:ascii="Arial" w:hAnsi="Arial"/>
-                <w:b w:val="0"/>
-                <w:color w:val="1E293B"/>
-                <w:sz w:val="18"/>
-              </w:rPr>
-              <w:t>Param: id, Body: status</w:t>
-            </w:r>
-          </w:p>
-        </w:tc>
-        <w:tc>
-          <w:tcPr>
-            <w:tcW w:type="dxa" w:w="1584"/>
-            <w:shd w:fill="FFFFFF"/>
-            <w:tcMar>
-              <w:top w:w="90" w:type="dxa"/>
-              <w:bottom w:w="90" w:type="dxa"/>
-              <w:left w:w="140" w:type="dxa"/>
-              <w:right w:w="140" w:type="dxa"/>
-            </w:tcMar>
-          </w:tcPr>
-          <w:p>
-            <w:pPr>
-              <w:jc w:val="left"/>
-            </w:pPr>
-            <w:r>
-              <w:rPr>
-                <w:rFonts w:ascii="Arial" w:hAnsi="Arial"/>
-                <w:b w:val="0"/>
-                <w:color w:val="1E293B"/>
-                <w:sz w:val="18"/>
-              </w:rPr>
-              <w:t>JSON Object</w:t>
-            </w:r>
-          </w:p>
-        </w:tc>
-        <w:tc>
-          <w:tcPr>
-            <w:tcW w:type="dxa" w:w="3888"/>
-            <w:shd w:fill="FFFFFF"/>
-            <w:tcMar>
-              <w:top w:w="90" w:type="dxa"/>
-              <w:bottom w:w="90" w:type="dxa"/>
-              <w:left w:w="140" w:type="dxa"/>
-              <w:right w:w="140" w:type="dxa"/>
-            </w:tcMar>
-          </w:tcPr>
-          <w:p>
-            <w:pPr>
-              <w:jc w:val="left"/>
-            </w:pPr>
-            <w:r>
-              <w:rPr>
-                <w:rFonts w:ascii="Arial" w:hAnsi="Arial"/>
-                <w:b w:val="0"/>
-                <w:color w:val="1E293B"/>
-                <w:sz w:val="18"/>
-              </w:rPr>
-              <w:t>Updates appointment status to Scheduled, Completed, or Cancelled.</w:t>
-            </w:r>
-          </w:p>
-        </w:tc>
-      </w:tr>
-      <w:tr>
-        <w:tc>
-          <w:tcPr>
-            <w:tcW w:type="dxa" w:w="2592"/>
-            <w:shd w:fill="F8FAFC"/>
-            <w:tcMar>
-              <w:top w:w="90" w:type="dxa"/>
-              <w:bottom w:w="90" w:type="dxa"/>
-              <w:left w:w="140" w:type="dxa"/>
-              <w:right w:w="140" w:type="dxa"/>
-            </w:tcMar>
-          </w:tcPr>
-          <w:p>
-            <w:pPr>
-              <w:jc w:val="left"/>
-            </w:pPr>
-            <w:r>
-              <w:rPr>
-                <w:rFonts w:ascii="Consolas" w:hAnsi="Consolas"/>
-                <w:b/>
-                <w:color w:val="0E7490"/>
-                <w:sz w:val="18"/>
-              </w:rPr>
-              <w:t>GET /api/prescriptions</w:t>
-            </w:r>
-          </w:p>
-        </w:tc>
-        <w:tc>
-          <w:tcPr>
-            <w:tcW w:type="dxa" w:w="2016"/>
-            <w:shd w:fill="F8FAFC"/>
-            <w:tcMar>
-              <w:top w:w="90" w:type="dxa"/>
-              <w:bottom w:w="90" w:type="dxa"/>
-              <w:left w:w="140" w:type="dxa"/>
-              <w:right w:w="140" w:type="dxa"/>
-            </w:tcMar>
-          </w:tcPr>
-          <w:p>
-            <w:pPr>
-              <w:jc w:val="left"/>
-            </w:pPr>
-            <w:r>
-              <w:rPr>
-                <w:rFonts w:ascii="Arial" w:hAnsi="Arial"/>
-                <w:b w:val="0"/>
-                <w:color w:val="1E293B"/>
-                <w:sz w:val="18"/>
-              </w:rPr>
-              <w:t>None</w:t>
-            </w:r>
-          </w:p>
-        </w:tc>
-        <w:tc>
-          <w:tcPr>
-            <w:tcW w:type="dxa" w:w="1584"/>
-            <w:shd w:fill="F8FAFC"/>
-            <w:tcMar>
-              <w:top w:w="90" w:type="dxa"/>
-              <w:bottom w:w="90" w:type="dxa"/>
-              <w:left w:w="140" w:type="dxa"/>
-              <w:right w:w="140" w:type="dxa"/>
-            </w:tcMar>
-          </w:tcPr>
-          <w:p>
-            <w:pPr>
-              <w:jc w:val="left"/>
-            </w:pPr>
-            <w:r>
-              <w:rPr>
-                <w:rFonts w:ascii="Arial" w:hAnsi="Arial"/>
-                <w:b w:val="0"/>
-                <w:color w:val="1E293B"/>
-                <w:sz w:val="18"/>
-              </w:rPr>
-              <w:t>JSON Array</w:t>
-            </w:r>
-          </w:p>
-        </w:tc>
-        <w:tc>
-          <w:tcPr>
-            <w:tcW w:type="dxa" w:w="3888"/>
-            <w:shd w:fill="F8FAFC"/>
-            <w:tcMar>
-              <w:top w:w="90" w:type="dxa"/>
-              <w:bottom w:w="90" w:type="dxa"/>
-              <w:left w:w="140" w:type="dxa"/>
-              <w:right w:w="140" w:type="dxa"/>
-            </w:tcMar>
-          </w:tcPr>
-          <w:p>
-            <w:pPr>
-              <w:jc w:val="left"/>
-            </w:pPr>
-            <w:r>
-              <w:rPr>
-                <w:rFonts w:ascii="Arial" w:hAnsi="Arial"/>
-                <w:b w:val="0"/>
-                <w:color w:val="1E293B"/>
-                <w:sz w:val="18"/>
-              </w:rPr>
-              <w:t>Returns list of all digital prescriptions.</w:t>
-            </w:r>
-          </w:p>
-        </w:tc>
-      </w:tr>
-      <w:tr>
-        <w:tc>
-          <w:tcPr>
-            <w:tcW w:type="dxa" w:w="2592"/>
-            <w:shd w:fill="FFFFFF"/>
-            <w:tcMar>
-              <w:top w:w="90" w:type="dxa"/>
-              <w:bottom w:w="90" w:type="dxa"/>
-              <w:left w:w="140" w:type="dxa"/>
-              <w:right w:w="140" w:type="dxa"/>
-            </w:tcMar>
-          </w:tcPr>
-          <w:p>
-            <w:pPr>
-              <w:jc w:val="left"/>
-            </w:pPr>
-            <w:r>
-              <w:rPr>
-                <w:rFonts w:ascii="Consolas" w:hAnsi="Consolas"/>
-                <w:b/>
-                <w:color w:val="0E7490"/>
-                <w:sz w:val="18"/>
-              </w:rPr>
-              <w:t>POST /api/prescriptions</w:t>
-            </w:r>
-          </w:p>
-        </w:tc>
-        <w:tc>
-          <w:tcPr>
-            <w:tcW w:type="dxa" w:w="2016"/>
-            <w:shd w:fill="FFFFFF"/>
-            <w:tcMar>
-              <w:top w:w="90" w:type="dxa"/>
-              <w:bottom w:w="90" w:type="dxa"/>
-              <w:left w:w="140" w:type="dxa"/>
-              <w:right w:w="140" w:type="dxa"/>
-            </w:tcMar>
-          </w:tcPr>
-          <w:p>
-            <w:pPr>
-              <w:jc w:val="left"/>
-            </w:pPr>
-            <w:r>
-              <w:rPr>
-                <w:rFonts w:ascii="Arial" w:hAnsi="Arial"/>
-                <w:b w:val="0"/>
-                <w:color w:val="1E293B"/>
-                <w:sz w:val="18"/>
-              </w:rPr>
-              <w:t>Body: Rx Data</w:t>
-            </w:r>
-          </w:p>
-        </w:tc>
-        <w:tc>
-          <w:tcPr>
-            <w:tcW w:type="dxa" w:w="1584"/>
-            <w:shd w:fill="FFFFFF"/>
-            <w:tcMar>
-              <w:top w:w="90" w:type="dxa"/>
-              <w:bottom w:w="90" w:type="dxa"/>
-              <w:left w:w="140" w:type="dxa"/>
-              <w:right w:w="140" w:type="dxa"/>
-            </w:tcMar>
-          </w:tcPr>
-          <w:p>
-            <w:pPr>
-              <w:jc w:val="left"/>
-            </w:pPr>
-            <w:r>
-              <w:rPr>
-                <w:rFonts w:ascii="Arial" w:hAnsi="Arial"/>
-                <w:b w:val="0"/>
-                <w:color w:val="1E293B"/>
-                <w:sz w:val="18"/>
-              </w:rPr>
-              <w:t>JSON Object</w:t>
-            </w:r>
-          </w:p>
-        </w:tc>
-        <w:tc>
-          <w:tcPr>
-            <w:tcW w:type="dxa" w:w="3888"/>
-            <w:shd w:fill="FFFFFF"/>
-            <w:tcMar>
-              <w:top w:w="90" w:type="dxa"/>
-              <w:bottom w:w="90" w:type="dxa"/>
-              <w:left w:w="140" w:type="dxa"/>
-              <w:right w:w="140" w:type="dxa"/>
-            </w:tcMar>
-          </w:tcPr>
-          <w:p>
-            <w:pPr>
-              <w:jc w:val="left"/>
-            </w:pPr>
-            <w:r>
-              <w:rPr>
-                <w:rFonts w:ascii="Arial" w:hAnsi="Arial"/>
-                <w:b w:val="0"/>
-                <w:color w:val="1E293B"/>
-                <w:sz w:val="18"/>
-              </w:rPr>
-              <w:t>Creates prescription and marks associated appointment as Completed.</w:t>
-            </w:r>
-          </w:p>
-        </w:tc>
-      </w:tr>
-      <w:tr>
-        <w:tc>
-          <w:tcPr>
-            <w:tcW w:type="dxa" w:w="2592"/>
-            <w:shd w:fill="F8FAFC"/>
-            <w:tcMar>
-              <w:top w:w="90" w:type="dxa"/>
-              <w:bottom w:w="90" w:type="dxa"/>
-              <w:left w:w="140" w:type="dxa"/>
-              <w:right w:w="140" w:type="dxa"/>
-            </w:tcMar>
-          </w:tcPr>
-          <w:p>
-            <w:pPr>
-              <w:jc w:val="left"/>
-            </w:pPr>
-            <w:r>
-              <w:rPr>
-                <w:rFonts w:ascii="Consolas" w:hAnsi="Consolas"/>
-                <w:b/>
-                <w:color w:val="0E7490"/>
-                <w:sz w:val="18"/>
-              </w:rPr>
-              <w:t>GET /api/lab/reports</w:t>
-            </w:r>
-          </w:p>
-        </w:tc>
-        <w:tc>
-          <w:tcPr>
-            <w:tcW w:type="dxa" w:w="2016"/>
-            <w:shd w:fill="F8FAFC"/>
-            <w:tcMar>
-              <w:top w:w="90" w:type="dxa"/>
-              <w:bottom w:w="90" w:type="dxa"/>
-              <w:left w:w="140" w:type="dxa"/>
-              <w:right w:w="140" w:type="dxa"/>
-            </w:tcMar>
-          </w:tcPr>
-          <w:p>
-            <w:pPr>
-              <w:jc w:val="left"/>
-            </w:pPr>
-            <w:r>
-              <w:rPr>
-                <w:rFonts w:ascii="Arial" w:hAnsi="Arial"/>
-                <w:b w:val="0"/>
-                <w:color w:val="1E293B"/>
-                <w:sz w:val="18"/>
-              </w:rPr>
-              <w:t>None</w:t>
-            </w:r>
-          </w:p>
-        </w:tc>
-        <w:tc>
-          <w:tcPr>
-            <w:tcW w:type="dxa" w:w="1584"/>
-            <w:shd w:fill="F8FAFC"/>
-            <w:tcMar>
-              <w:top w:w="90" w:type="dxa"/>
-              <w:bottom w:w="90" w:type="dxa"/>
-              <w:left w:w="140" w:type="dxa"/>
-              <w:right w:w="140" w:type="dxa"/>
-            </w:tcMar>
-          </w:tcPr>
-          <w:p>
-            <w:pPr>
-              <w:jc w:val="left"/>
-            </w:pPr>
-            <w:r>
-              <w:rPr>
-                <w:rFonts w:ascii="Arial" w:hAnsi="Arial"/>
-                <w:b w:val="0"/>
-                <w:color w:val="1E293B"/>
-                <w:sz w:val="18"/>
-              </w:rPr>
-              <w:t>JSON Array</w:t>
-            </w:r>
-          </w:p>
-        </w:tc>
-        <w:tc>
-          <w:tcPr>
-            <w:tcW w:type="dxa" w:w="3888"/>
-            <w:shd w:fill="F8FAFC"/>
-            <w:tcMar>
-              <w:top w:w="90" w:type="dxa"/>
-              <w:bottom w:w="90" w:type="dxa"/>
-              <w:left w:w="140" w:type="dxa"/>
-              <w:right w:w="140" w:type="dxa"/>
-            </w:tcMar>
-          </w:tcPr>
-          <w:p>
-            <w:pPr>
-              <w:jc w:val="left"/>
-            </w:pPr>
-            <w:r>
-              <w:rPr>
-                <w:rFonts w:ascii="Arial" w:hAnsi="Arial"/>
-                <w:b w:val="0"/>
-                <w:color w:val="1E293B"/>
-                <w:sz w:val="18"/>
-              </w:rPr>
-              <w:t>Returns patient laboratory test results and diagnostic status.</w:t>
-            </w:r>
-          </w:p>
-        </w:tc>
-      </w:tr>
-      <w:tr>
-        <w:tc>
-          <w:tcPr>
-            <w:tcW w:type="dxa" w:w="2592"/>
-            <w:shd w:fill="FFFFFF"/>
-            <w:tcMar>
-              <w:top w:w="90" w:type="dxa"/>
-              <w:bottom w:w="90" w:type="dxa"/>
-              <w:left w:w="140" w:type="dxa"/>
-              <w:right w:w="140" w:type="dxa"/>
-            </w:tcMar>
-          </w:tcPr>
-          <w:p>
-            <w:pPr>
-              <w:jc w:val="left"/>
-            </w:pPr>
-            <w:r>
-              <w:rPr>
-                <w:rFonts w:ascii="Consolas" w:hAnsi="Consolas"/>
-                <w:b/>
-                <w:color w:val="0E7490"/>
-                <w:sz w:val="18"/>
-              </w:rPr>
-              <w:t>GET /api/lab/packages</w:t>
-            </w:r>
-          </w:p>
-        </w:tc>
-        <w:tc>
-          <w:tcPr>
-            <w:tcW w:type="dxa" w:w="2016"/>
-            <w:shd w:fill="FFFFFF"/>
-            <w:tcMar>
-              <w:top w:w="90" w:type="dxa"/>
-              <w:bottom w:w="90" w:type="dxa"/>
-              <w:left w:w="140" w:type="dxa"/>
-              <w:right w:w="140" w:type="dxa"/>
-            </w:tcMar>
-          </w:tcPr>
-          <w:p>
-            <w:pPr>
-              <w:jc w:val="left"/>
-            </w:pPr>
-            <w:r>
-              <w:rPr>
-                <w:rFonts w:ascii="Arial" w:hAnsi="Arial"/>
-                <w:b w:val="0"/>
-                <w:color w:val="1E293B"/>
-                <w:sz w:val="18"/>
-              </w:rPr>
-              <w:t>None</w:t>
-            </w:r>
-          </w:p>
-        </w:tc>
-        <w:tc>
-          <w:tcPr>
-            <w:tcW w:type="dxa" w:w="1584"/>
-            <w:shd w:fill="FFFFFF"/>
-            <w:tcMar>
-              <w:top w:w="90" w:type="dxa"/>
-              <w:bottom w:w="90" w:type="dxa"/>
-              <w:left w:w="140" w:type="dxa"/>
-              <w:right w:w="140" w:type="dxa"/>
-            </w:tcMar>
-          </w:tcPr>
-          <w:p>
-            <w:pPr>
-              <w:jc w:val="left"/>
-            </w:pPr>
-            <w:r>
-              <w:rPr>
-                <w:rFonts w:ascii="Arial" w:hAnsi="Arial"/>
-                <w:b w:val="0"/>
-                <w:color w:val="1E293B"/>
-                <w:sz w:val="18"/>
-              </w:rPr>
-              <w:t>JSON Array</w:t>
-            </w:r>
-          </w:p>
-        </w:tc>
-        <w:tc>
-          <w:tcPr>
-            <w:tcW w:type="dxa" w:w="3888"/>
-            <w:shd w:fill="FFFFFF"/>
-            <w:tcMar>
-              <w:top w:w="90" w:type="dxa"/>
-              <w:bottom w:w="90" w:type="dxa"/>
-              <w:left w:w="140" w:type="dxa"/>
-              <w:right w:w="140" w:type="dxa"/>
-            </w:tcMar>
-          </w:tcPr>
-          <w:p>
-            <w:pPr>
-              <w:jc w:val="left"/>
-            </w:pPr>
-            <w:r>
-              <w:rPr>
-                <w:rFonts w:ascii="Arial" w:hAnsi="Arial"/>
-                <w:b w:val="0"/>
-                <w:color w:val="1E293B"/>
-                <w:sz w:val="18"/>
-              </w:rPr>
-              <w:t>Returns available diagnostic health packages (CBC, CMP, Lipid, Thyroid, Full Body).</w:t>
-            </w:r>
-          </w:p>
-        </w:tc>
-      </w:tr>
-      <w:tr>
-        <w:tc>
-          <w:tcPr>
-            <w:tcW w:type="dxa" w:w="2592"/>
-            <w:shd w:fill="F8FAFC"/>
-            <w:tcMar>
-              <w:top w:w="90" w:type="dxa"/>
-              <w:bottom w:w="90" w:type="dxa"/>
-              <w:left w:w="140" w:type="dxa"/>
-              <w:right w:w="140" w:type="dxa"/>
-            </w:tcMar>
-          </w:tcPr>
-          <w:p>
-            <w:pPr>
-              <w:jc w:val="left"/>
-            </w:pPr>
-            <w:r>
-              <w:rPr>
-                <w:rFonts w:ascii="Consolas" w:hAnsi="Consolas"/>
-                <w:b/>
-                <w:color w:val="0E7490"/>
-                <w:sz w:val="18"/>
-              </w:rPr>
-              <w:t>GET /api/lab/home-sample</w:t>
-            </w:r>
-          </w:p>
-        </w:tc>
-        <w:tc>
-          <w:tcPr>
-            <w:tcW w:type="dxa" w:w="2016"/>
-            <w:shd w:fill="F8FAFC"/>
-            <w:tcMar>
-              <w:top w:w="90" w:type="dxa"/>
-              <w:bottom w:w="90" w:type="dxa"/>
-              <w:left w:w="140" w:type="dxa"/>
-              <w:right w:w="140" w:type="dxa"/>
-            </w:tcMar>
-          </w:tcPr>
-          <w:p>
-            <w:pPr>
-              <w:jc w:val="left"/>
-            </w:pPr>
-            <w:r>
-              <w:rPr>
-                <w:rFonts w:ascii="Arial" w:hAnsi="Arial"/>
-                <w:b w:val="0"/>
-                <w:color w:val="1E293B"/>
-                <w:sz w:val="18"/>
-              </w:rPr>
-              <w:t>None</w:t>
-            </w:r>
-          </w:p>
-        </w:tc>
-        <w:tc>
-          <w:tcPr>
-            <w:tcW w:type="dxa" w:w="1584"/>
-            <w:shd w:fill="F8FAFC"/>
-            <w:tcMar>
-              <w:top w:w="90" w:type="dxa"/>
-              <w:bottom w:w="90" w:type="dxa"/>
-              <w:left w:w="140" w:type="dxa"/>
-              <w:right w:w="140" w:type="dxa"/>
-            </w:tcMar>
-          </w:tcPr>
-          <w:p>
-            <w:pPr>
-              <w:jc w:val="left"/>
-            </w:pPr>
-            <w:r>
-              <w:rPr>
-                <w:rFonts w:ascii="Arial" w:hAnsi="Arial"/>
-                <w:b w:val="0"/>
-                <w:color w:val="1E293B"/>
-                <w:sz w:val="18"/>
-              </w:rPr>
-              <w:t>JSON Array</w:t>
-            </w:r>
-          </w:p>
-        </w:tc>
-        <w:tc>
-          <w:tcPr>
-            <w:tcW w:type="dxa" w:w="3888"/>
-            <w:shd w:fill="F8FAFC"/>
-            <w:tcMar>
-              <w:top w:w="90" w:type="dxa"/>
-              <w:bottom w:w="90" w:type="dxa"/>
-              <w:left w:w="140" w:type="dxa"/>
-              <w:right w:w="140" w:type="dxa"/>
-            </w:tcMar>
-          </w:tcPr>
-          <w:p>
-            <w:pPr>
-              <w:jc w:val="left"/>
-            </w:pPr>
-            <w:r>
-              <w:rPr>
-                <w:rFonts w:ascii="Arial" w:hAnsi="Arial"/>
-                <w:b w:val="0"/>
-                <w:color w:val="1E293B"/>
-                <w:sz w:val="18"/>
-              </w:rPr>
-              <w:t>Returns all home sample pickup orders.</w:t>
-            </w:r>
-          </w:p>
-        </w:tc>
-      </w:tr>
-      <w:tr>
-        <w:tc>
-          <w:tcPr>
-            <w:tcW w:type="dxa" w:w="2592"/>
-            <w:shd w:fill="FFFFFF"/>
-            <w:tcMar>
-              <w:top w:w="90" w:type="dxa"/>
-              <w:bottom w:w="90" w:type="dxa"/>
-              <w:left w:w="140" w:type="dxa"/>
-              <w:right w:w="140" w:type="dxa"/>
-            </w:tcMar>
-          </w:tcPr>
-          <w:p>
-            <w:pPr>
-              <w:jc w:val="left"/>
-            </w:pPr>
-            <w:r>
-              <w:rPr>
-                <w:rFonts w:ascii="Consolas" w:hAnsi="Consolas"/>
-                <w:b/>
-                <w:color w:val="0E7490"/>
-                <w:sz w:val="18"/>
-              </w:rPr>
-              <w:t>POST /api/lab/home-sample</w:t>
-            </w:r>
-          </w:p>
-        </w:tc>
-        <w:tc>
-          <w:tcPr>
-            <w:tcW w:type="dxa" w:w="2016"/>
-            <w:shd w:fill="FFFFFF"/>
-            <w:tcMar>
-              <w:top w:w="90" w:type="dxa"/>
-              <w:bottom w:w="90" w:type="dxa"/>
-              <w:left w:w="140" w:type="dxa"/>
-              <w:right w:w="140" w:type="dxa"/>
-            </w:tcMar>
-          </w:tcPr>
-          <w:p>
-            <w:pPr>
-              <w:jc w:val="left"/>
-            </w:pPr>
-            <w:r>
-              <w:rPr>
-                <w:rFonts w:ascii="Arial" w:hAnsi="Arial"/>
-                <w:b w:val="0"/>
-                <w:color w:val="1E293B"/>
-                <w:sz w:val="18"/>
-              </w:rPr>
-              <w:t>Body: Order Data</w:t>
-            </w:r>
-          </w:p>
-        </w:tc>
-        <w:tc>
-          <w:tcPr>
-            <w:tcW w:type="dxa" w:w="1584"/>
-            <w:shd w:fill="FFFFFF"/>
-            <w:tcMar>
-              <w:top w:w="90" w:type="dxa"/>
-              <w:bottom w:w="90" w:type="dxa"/>
-              <w:left w:w="140" w:type="dxa"/>
-              <w:right w:w="140" w:type="dxa"/>
-            </w:tcMar>
-          </w:tcPr>
-          <w:p>
-            <w:pPr>
-              <w:jc w:val="left"/>
-            </w:pPr>
-            <w:r>
-              <w:rPr>
-                <w:rFonts w:ascii="Arial" w:hAnsi="Arial"/>
-                <w:b w:val="0"/>
-                <w:color w:val="1E293B"/>
-                <w:sz w:val="18"/>
-              </w:rPr>
-              <w:t>JSON Object</w:t>
-            </w:r>
-          </w:p>
-        </w:tc>
-        <w:tc>
-          <w:tcPr>
-            <w:tcW w:type="dxa" w:w="3888"/>
-            <w:shd w:fill="FFFFFF"/>
-            <w:tcMar>
-              <w:top w:w="90" w:type="dxa"/>
-              <w:bottom w:w="90" w:type="dxa"/>
-              <w:left w:w="140" w:type="dxa"/>
-              <w:right w:w="140" w:type="dxa"/>
-            </w:tcMar>
-          </w:tcPr>
-          <w:p>
-            <w:pPr>
-              <w:jc w:val="left"/>
-            </w:pPr>
-            <w:r>
-              <w:rPr>
-                <w:rFonts w:ascii="Arial" w:hAnsi="Arial"/>
-                <w:b w:val="0"/>
-                <w:color w:val="1E293B"/>
-                <w:sz w:val="18"/>
-              </w:rPr>
-              <w:t>Books a home sample collection and creates initial 5-stage timeline.</w:t>
-            </w:r>
-          </w:p>
-        </w:tc>
-      </w:tr>
-      <w:tr>
-        <w:tc>
-          <w:tcPr>
-            <w:tcW w:type="dxa" w:w="2592"/>
-            <w:shd w:fill="F8FAFC"/>
-            <w:tcMar>
-              <w:top w:w="90" w:type="dxa"/>
-              <w:bottom w:w="90" w:type="dxa"/>
-              <w:left w:w="140" w:type="dxa"/>
-              <w:right w:w="140" w:type="dxa"/>
-            </w:tcMar>
-          </w:tcPr>
-          <w:p>
-            <w:pPr>
-              <w:jc w:val="left"/>
-            </w:pPr>
-            <w:r>
-              <w:rPr>
-                <w:rFonts w:ascii="Consolas" w:hAnsi="Consolas"/>
-                <w:b/>
-                <w:color w:val="0E7490"/>
-                <w:sz w:val="18"/>
-              </w:rPr>
-              <w:t>PATCH /api/lab/orders/:id/status</w:t>
-            </w:r>
-          </w:p>
-        </w:tc>
-        <w:tc>
-          <w:tcPr>
-            <w:tcW w:type="dxa" w:w="2016"/>
-            <w:shd w:fill="F8FAFC"/>
-            <w:tcMar>
-              <w:top w:w="90" w:type="dxa"/>
-              <w:bottom w:w="90" w:type="dxa"/>
-              <w:left w:w="140" w:type="dxa"/>
-              <w:right w:w="140" w:type="dxa"/>
-            </w:tcMar>
-          </w:tcPr>
-          <w:p>
-            <w:pPr>
-              <w:jc w:val="left"/>
-            </w:pPr>
-            <w:r>
-              <w:rPr>
-                <w:rFonts w:ascii="Arial" w:hAnsi="Arial"/>
-                <w:b w:val="0"/>
-                <w:color w:val="1E293B"/>
-                <w:sz w:val="18"/>
-              </w:rPr>
-              <w:t>Param: id, Body: status</w:t>
-            </w:r>
-          </w:p>
-        </w:tc>
-        <w:tc>
-          <w:tcPr>
-            <w:tcW w:type="dxa" w:w="1584"/>
-            <w:shd w:fill="F8FAFC"/>
-            <w:tcMar>
-              <w:top w:w="90" w:type="dxa"/>
-              <w:bottom w:w="90" w:type="dxa"/>
-              <w:left w:w="140" w:type="dxa"/>
-              <w:right w:w="140" w:type="dxa"/>
-            </w:tcMar>
-          </w:tcPr>
-          <w:p>
-            <w:pPr>
-              <w:jc w:val="left"/>
-            </w:pPr>
-            <w:r>
-              <w:rPr>
-                <w:rFonts w:ascii="Arial" w:hAnsi="Arial"/>
-                <w:b w:val="0"/>
-                <w:color w:val="1E293B"/>
-                <w:sz w:val="18"/>
-              </w:rPr>
-              <w:t>JSON Object</w:t>
-            </w:r>
-          </w:p>
-        </w:tc>
-        <w:tc>
-          <w:tcPr>
-            <w:tcW w:type="dxa" w:w="3888"/>
-            <w:shd w:fill="F8FAFC"/>
-            <w:tcMar>
-              <w:top w:w="90" w:type="dxa"/>
-              <w:bottom w:w="90" w:type="dxa"/>
-              <w:left w:w="140" w:type="dxa"/>
-              <w:right w:w="140" w:type="dxa"/>
-            </w:tcMar>
-          </w:tcPr>
-          <w:p>
-            <w:pPr>
-              <w:jc w:val="left"/>
-            </w:pPr>
-            <w:r>
-              <w:rPr>
-                <w:rFonts w:ascii="Arial" w:hAnsi="Arial"/>
-                <w:b w:val="0"/>
-                <w:color w:val="1E293B"/>
-                <w:sz w:val="18"/>
-              </w:rPr>
-              <w:t>Advances doorstep sample collection stage and assigns phlebotomist.</w:t>
-            </w:r>
-          </w:p>
-        </w:tc>
-      </w:tr>
-      <w:tr>
-        <w:tc>
-          <w:tcPr>
-            <w:tcW w:type="dxa" w:w="2592"/>
-            <w:shd w:fill="FFFFFF"/>
-            <w:tcMar>
-              <w:top w:w="90" w:type="dxa"/>
-              <w:bottom w:w="90" w:type="dxa"/>
-              <w:left w:w="140" w:type="dxa"/>
-              <w:right w:w="140" w:type="dxa"/>
-            </w:tcMar>
-          </w:tcPr>
-          <w:p>
-            <w:pPr>
-              <w:jc w:val="left"/>
-            </w:pPr>
-            <w:r>
-              <w:rPr>
-                <w:rFonts w:ascii="Consolas" w:hAnsi="Consolas"/>
-                <w:b/>
-                <w:color w:val="0E7490"/>
-                <w:sz w:val="18"/>
-              </w:rPr>
-              <w:t>GET /api/admin/stats</w:t>
-            </w:r>
-          </w:p>
-        </w:tc>
-        <w:tc>
-          <w:tcPr>
-            <w:tcW w:type="dxa" w:w="2016"/>
-            <w:shd w:fill="FFFFFF"/>
-            <w:tcMar>
-              <w:top w:w="90" w:type="dxa"/>
-              <w:bottom w:w="90" w:type="dxa"/>
-              <w:left w:w="140" w:type="dxa"/>
-              <w:right w:w="140" w:type="dxa"/>
-            </w:tcMar>
-          </w:tcPr>
-          <w:p>
-            <w:pPr>
-              <w:jc w:val="left"/>
-            </w:pPr>
-            <w:r>
-              <w:rPr>
-                <w:rFonts w:ascii="Arial" w:hAnsi="Arial"/>
-                <w:b w:val="0"/>
-                <w:color w:val="1E293B"/>
-                <w:sz w:val="18"/>
-              </w:rPr>
-              <w:t>None</w:t>
-            </w:r>
-          </w:p>
-        </w:tc>
-        <w:tc>
-          <w:tcPr>
-            <w:tcW w:type="dxa" w:w="1584"/>
-            <w:shd w:fill="FFFFFF"/>
-            <w:tcMar>
-              <w:top w:w="90" w:type="dxa"/>
-              <w:bottom w:w="90" w:type="dxa"/>
-              <w:left w:w="140" w:type="dxa"/>
-              <w:right w:w="140" w:type="dxa"/>
-            </w:tcMar>
-          </w:tcPr>
-          <w:p>
-            <w:pPr>
-              <w:jc w:val="left"/>
-            </w:pPr>
-            <w:r>
-              <w:rPr>
-                <w:rFonts w:ascii="Arial" w:hAnsi="Arial"/>
-                <w:b w:val="0"/>
-                <w:color w:val="1E293B"/>
-                <w:sz w:val="18"/>
-              </w:rPr>
-              <w:t>JSON Object</w:t>
-            </w:r>
-          </w:p>
-        </w:tc>
-        <w:tc>
-          <w:tcPr>
-            <w:tcW w:type="dxa" w:w="3888"/>
-            <w:shd w:fill="FFFFFF"/>
-            <w:tcMar>
-              <w:top w:w="90" w:type="dxa"/>
-              <w:bottom w:w="90" w:type="dxa"/>
-              <w:left w:w="140" w:type="dxa"/>
-              <w:right w:w="140" w:type="dxa"/>
-            </w:tcMar>
-          </w:tcPr>
-          <w:p>
-            <w:pPr>
-              <w:jc w:val="left"/>
-            </w:pPr>
-            <w:r>
-              <w:rPr>
-                <w:rFonts w:ascii="Arial" w:hAnsi="Arial"/>
-                <w:b w:val="0"/>
-                <w:color w:val="1E293B"/>
-                <w:sz w:val="18"/>
-              </w:rPr>
-              <w:t>Calculates aggregated hospital metrics (revenue, bed occupancy, doctor roster count).</w:t>
-            </w:r>
-          </w:p>
-        </w:tc>
-      </w:tr>
-      <w:tr>
-        <w:tc>
-          <w:tcPr>
-            <w:tcW w:type="dxa" w:w="2592"/>
-            <w:shd w:fill="F8FAFC"/>
-            <w:tcMar>
-              <w:top w:w="90" w:type="dxa"/>
-              <w:bottom w:w="90" w:type="dxa"/>
-              <w:left w:w="140" w:type="dxa"/>
-              <w:right w:w="140" w:type="dxa"/>
-            </w:tcMar>
-          </w:tcPr>
-          <w:p>
-            <w:pPr>
-              <w:jc w:val="left"/>
-            </w:pPr>
-            <w:r>
-              <w:rPr>
-                <w:rFonts w:ascii="Consolas" w:hAnsi="Consolas"/>
-                <w:b/>
-                <w:color w:val="0E7490"/>
-                <w:sz w:val="18"/>
-              </w:rPr>
-              <w:t>GET /api/chat/history</w:t>
-            </w:r>
-          </w:p>
-        </w:tc>
-        <w:tc>
-          <w:tcPr>
-            <w:tcW w:type="dxa" w:w="2016"/>
-            <w:shd w:fill="F8FAFC"/>
-            <w:tcMar>
-              <w:top w:w="90" w:type="dxa"/>
-              <w:bottom w:w="90" w:type="dxa"/>
-              <w:left w:w="140" w:type="dxa"/>
-              <w:right w:w="140" w:type="dxa"/>
-            </w:tcMar>
-          </w:tcPr>
-          <w:p>
-            <w:pPr>
-              <w:jc w:val="left"/>
-            </w:pPr>
-            <w:r>
-              <w:rPr>
-                <w:rFonts w:ascii="Arial" w:hAnsi="Arial"/>
-                <w:b w:val="0"/>
-                <w:color w:val="1E293B"/>
-                <w:sz w:val="18"/>
-              </w:rPr>
-              <w:t>Query: sessionId</w:t>
-            </w:r>
-          </w:p>
-        </w:tc>
-        <w:tc>
-          <w:tcPr>
-            <w:tcW w:type="dxa" w:w="1584"/>
-            <w:shd w:fill="F8FAFC"/>
-            <w:tcMar>
-              <w:top w:w="90" w:type="dxa"/>
-              <w:bottom w:w="90" w:type="dxa"/>
-              <w:left w:w="140" w:type="dxa"/>
-              <w:right w:w="140" w:type="dxa"/>
-            </w:tcMar>
-          </w:tcPr>
-          <w:p>
-            <w:pPr>
-              <w:jc w:val="left"/>
-            </w:pPr>
-            <w:r>
-              <w:rPr>
-                <w:rFonts w:ascii="Arial" w:hAnsi="Arial"/>
-                <w:b w:val="0"/>
-                <w:color w:val="1E293B"/>
-                <w:sz w:val="18"/>
-              </w:rPr>
-              <w:t>JSON Array</w:t>
-            </w:r>
-          </w:p>
-        </w:tc>
-        <w:tc>
-          <w:tcPr>
-            <w:tcW w:type="dxa" w:w="3888"/>
-            <w:shd w:fill="F8FAFC"/>
-            <w:tcMar>
-              <w:top w:w="90" w:type="dxa"/>
-              <w:bottom w:w="90" w:type="dxa"/>
-              <w:left w:w="140" w:type="dxa"/>
-              <w:right w:w="140" w:type="dxa"/>
-            </w:tcMar>
-          </w:tcPr>
-          <w:p>
-            <w:pPr>
-              <w:jc w:val="left"/>
-            </w:pPr>
-            <w:r>
-              <w:rPr>
-                <w:rFonts w:ascii="Arial" w:hAnsi="Arial"/>
-                <w:b w:val="0"/>
-                <w:color w:val="1E293B"/>
-                <w:sz w:val="18"/>
-              </w:rPr>
-              <w:t>Retrieves conversational history for AI health assistant.</w:t>
-            </w:r>
-          </w:p>
-        </w:tc>
-      </w:tr>
-      <w:tr>
-        <w:tc>
-          <w:tcPr>
-            <w:tcW w:type="dxa" w:w="2592"/>
-            <w:shd w:fill="FFFFFF"/>
-            <w:tcMar>
-              <w:top w:w="90" w:type="dxa"/>
-              <w:bottom w:w="90" w:type="dxa"/>
-              <w:left w:w="140" w:type="dxa"/>
-              <w:right w:w="140" w:type="dxa"/>
-            </w:tcMar>
-          </w:tcPr>
-          <w:p>
-            <w:pPr>
-              <w:jc w:val="left"/>
-            </w:pPr>
-            <w:r>
-              <w:rPr>
-                <w:rFonts w:ascii="Consolas" w:hAnsi="Consolas"/>
-                <w:b/>
-                <w:color w:val="0E7490"/>
-                <w:sz w:val="18"/>
-              </w:rPr>
-              <w:t>POST /api/chat/message</w:t>
-            </w:r>
-          </w:p>
-        </w:tc>
-        <w:tc>
-          <w:tcPr>
-            <w:tcW w:type="dxa" w:w="2016"/>
-            <w:shd w:fill="FFFFFF"/>
-            <w:tcMar>
-              <w:top w:w="90" w:type="dxa"/>
-              <w:bottom w:w="90" w:type="dxa"/>
-              <w:left w:w="140" w:type="dxa"/>
-              <w:right w:w="140" w:type="dxa"/>
-            </w:tcMar>
-          </w:tcPr>
-          <w:p>
-            <w:pPr>
-              <w:jc w:val="left"/>
-            </w:pPr>
-            <w:r>
-              <w:rPr>
-                <w:rFonts w:ascii="Arial" w:hAnsi="Arial"/>
-                <w:b w:val="0"/>
-                <w:color w:val="1E293B"/>
-                <w:sz w:val="18"/>
-              </w:rPr>
-              <w:t>Body: Message Data</w:t>
-            </w:r>
-          </w:p>
-        </w:tc>
-        <w:tc>
-          <w:tcPr>
-            <w:tcW w:type="dxa" w:w="1584"/>
-            <w:shd w:fill="FFFFFF"/>
-            <w:tcMar>
-              <w:top w:w="90" w:type="dxa"/>
-              <w:bottom w:w="90" w:type="dxa"/>
-              <w:left w:w="140" w:type="dxa"/>
-              <w:right w:w="140" w:type="dxa"/>
-            </w:tcMar>
-          </w:tcPr>
-          <w:p>
-            <w:pPr>
-              <w:jc w:val="left"/>
-            </w:pPr>
-            <w:r>
-              <w:rPr>
-                <w:rFonts w:ascii="Arial" w:hAnsi="Arial"/>
-                <w:b w:val="0"/>
-                <w:color w:val="1E293B"/>
-                <w:sz w:val="18"/>
-              </w:rPr>
-              <w:t>JSON Object</w:t>
-            </w:r>
-          </w:p>
-        </w:tc>
-        <w:tc>
-          <w:tcPr>
-            <w:tcW w:type="dxa" w:w="3888"/>
-            <w:shd w:fill="FFFFFF"/>
-            <w:tcMar>
-              <w:top w:w="90" w:type="dxa"/>
-              <w:bottom w:w="90" w:type="dxa"/>
-              <w:left w:w="140" w:type="dxa"/>
-              <w:right w:w="140" w:type="dxa"/>
-            </w:tcMar>
-          </w:tcPr>
-          <w:p>
-            <w:pPr>
-              <w:jc w:val="left"/>
-            </w:pPr>
-            <w:r>
-              <w:rPr>
-                <w:rFonts w:ascii="Arial" w:hAnsi="Arial"/>
-                <w:b w:val="0"/>
-                <w:color w:val="1E293B"/>
-                <w:sz w:val="18"/>
-              </w:rPr>
-              <w:t>Saves user or bot message in SQLite chat store.</w:t>
-            </w:r>
-          </w:p>
-        </w:tc>
-      </w:tr>
-      <w:tr>
-        <w:tc>
-          <w:tcPr>
-            <w:tcW w:type="dxa" w:w="2592"/>
-            <w:shd w:fill="F8FAFC"/>
-            <w:tcMar>
-              <w:top w:w="90" w:type="dxa"/>
-              <w:bottom w:w="90" w:type="dxa"/>
-              <w:left w:w="140" w:type="dxa"/>
-              <w:right w:w="140" w:type="dxa"/>
-            </w:tcMar>
-          </w:tcPr>
-          <w:p>
-            <w:pPr>
-              <w:jc w:val="left"/>
-            </w:pPr>
-            <w:r>
-              <w:rPr>
-                <w:rFonts w:ascii="Consolas" w:hAnsi="Consolas"/>
-                <w:b/>
-                <w:color w:val="0E7490"/>
-                <w:sz w:val="18"/>
-              </w:rPr>
-              <w:t>DELETE /api/chat/history</w:t>
-            </w:r>
-          </w:p>
-        </w:tc>
-        <w:tc>
-          <w:tcPr>
-            <w:tcW w:type="dxa" w:w="2016"/>
-            <w:shd w:fill="F8FAFC"/>
-            <w:tcMar>
-              <w:top w:w="90" w:type="dxa"/>
-              <w:bottom w:w="90" w:type="dxa"/>
-              <w:left w:w="140" w:type="dxa"/>
-              <w:right w:w="140" w:type="dxa"/>
-            </w:tcMar>
-          </w:tcPr>
-          <w:p>
-            <w:pPr>
-              <w:jc w:val="left"/>
-            </w:pPr>
-            <w:r>
-              <w:rPr>
-                <w:rFonts w:ascii="Arial" w:hAnsi="Arial"/>
-                <w:b w:val="0"/>
-                <w:color w:val="1E293B"/>
-                <w:sz w:val="18"/>
-              </w:rPr>
-              <w:t>Query: sessionId</w:t>
-            </w:r>
-          </w:p>
-        </w:tc>
-        <w:tc>
-          <w:tcPr>
-            <w:tcW w:type="dxa" w:w="1584"/>
-            <w:shd w:fill="F8FAFC"/>
-            <w:tcMar>
-              <w:top w:w="90" w:type="dxa"/>
-              <w:bottom w:w="90" w:type="dxa"/>
-              <w:left w:w="140" w:type="dxa"/>
-              <w:right w:w="140" w:type="dxa"/>
-            </w:tcMar>
-          </w:tcPr>
-          <w:p>
-            <w:pPr>
-              <w:jc w:val="left"/>
-            </w:pPr>
-            <w:r>
-              <w:rPr>
-                <w:rFonts w:ascii="Arial" w:hAnsi="Arial"/>
-                <w:b w:val="0"/>
-                <w:color w:val="1E293B"/>
-                <w:sz w:val="18"/>
-              </w:rPr>
-              <w:t>JSON Object</w:t>
-            </w:r>
-          </w:p>
-        </w:tc>
-        <w:tc>
-          <w:tcPr>
-            <w:tcW w:type="dxa" w:w="3888"/>
-            <w:shd w:fill="F8FAFC"/>
-            <w:tcMar>
-              <w:top w:w="90" w:type="dxa"/>
-              <w:bottom w:w="90" w:type="dxa"/>
-              <w:left w:w="140" w:type="dxa"/>
-              <w:right w:w="140" w:type="dxa"/>
-            </w:tcMar>
-          </w:tcPr>
-          <w:p>
-            <w:pPr>
-              <w:jc w:val="left"/>
-            </w:pPr>
-            <w:r>
-              <w:rPr>
-                <w:rFonts w:ascii="Arial" w:hAnsi="Arial"/>
-                <w:b w:val="0"/>
-                <w:color w:val="1E293B"/>
-                <w:sz w:val="18"/>
-              </w:rPr>
-              <w:t>Clears chat session history for patient.</w:t>
-            </w:r>
-          </w:p>
-        </w:tc>
-      </w:tr>
-    </w:tbl>
-    <w:p>
-      <w:pPr>
-        <w:spacing w:after="240"/>
-      </w:pPr>
-    </w:p>
-    <w:p>
-      <w:pPr>
-        <w:pStyle w:val="Heading1"/>
-        <w:spacing w:before="320" w:after="80"/>
-      </w:pPr>
-      <w:r>
-        <w:t>5. Frontend Unified Data Access Layer (apiService)</w:t>
+        <w:t>4. Frontend Unified Data Access Layer (apiService)</w:t>
       </w:r>
     </w:p>
     <w:p>
@@ -13415,7 +9969,7 @@
         <w:spacing w:before="320" w:after="80"/>
       </w:pPr>
       <w:r>
-        <w:t>6. Firebase Cloud Database Service (firebaseService)</w:t>
+        <w:t>5. Firebase Cloud Database Service (firebaseService)</w:t>
       </w:r>
     </w:p>
     <w:p>
@@ -14317,7 +10871,7 @@
         <w:spacing w:before="320" w:after="80"/>
       </w:pPr>
       <w:r>
-        <w:t>7. AI Health Assistant &amp; Clinical Intelligence</w:t>
+        <w:t>6. AI Health Assistant &amp; Clinical Intelligence</w:t>
       </w:r>
     </w:p>
     <w:p>
@@ -15007,7 +11561,7 @@
         <w:spacing w:before="320" w:after="80"/>
       </w:pPr>
       <w:r>
-        <w:t>8. Authentication, Security &amp; Navigation Components</w:t>
+        <w:t>7. Authentication, Security &amp; Navigation Components</w:t>
       </w:r>
     </w:p>
     <w:p>
@@ -16015,7 +12569,7 @@
         <w:spacing w:before="320" w:after="80"/>
       </w:pPr>
       <w:r>
-        <w:t>9. Doctor Clinical Portal &amp; OPD Workflows</w:t>
+        <w:t>8. Doctor Clinical Portal &amp; OPD Workflows</w:t>
       </w:r>
     </w:p>
     <w:p>
@@ -17129,7 +13683,7 @@
         <w:spacing w:before="320" w:after="80"/>
       </w:pPr>
       <w:r>
-        <w:t>10. Patient Self-Service Portal &amp; EHR Locker</w:t>
+        <w:t>9. Patient Self-Service Portal &amp; EHR Locker</w:t>
       </w:r>
     </w:p>
     <w:p>
@@ -18031,7 +14585,7 @@
         <w:spacing w:before="320" w:after="80"/>
       </w:pPr>
       <w:r>
-        <w:t>11. Hospital Receptionist &amp; OPD Queue Desk</w:t>
+        <w:t>10. Hospital Receptionist &amp; OPD Queue Desk</w:t>
       </w:r>
     </w:p>
     <w:p>
@@ -18721,7 +15275,7 @@
         <w:spacing w:before="320" w:after="80"/>
       </w:pPr>
       <w:r>
-        <w:t>12. Hospital Administration &amp; Governance</w:t>
+        <w:t>11. Hospital Administration &amp; Governance</w:t>
       </w:r>
     </w:p>
     <w:p>
@@ -19411,7 +15965,7 @@
         <w:spacing w:before="320" w:after="80"/>
       </w:pPr>
       <w:r>
-        <w:t>13. Pan-India Secure EHR Sharing Portal</w:t>
+        <w:t>12. Pan-India Secure EHR Sharing Portal</w:t>
       </w:r>
     </w:p>
     <w:p>

</xml_diff>